<commit_message>
Completa o relatório do Momento 1 e adiciona a apresentação
- Relatório: capa com o grupo, nova secção "Ideia de negócio", proposta
  de valor reescrita em português, inquérito alinhado com o formulário
  (29 perguntas, sem a antiga P9) e taxa dada como decidida
- Secção 5 do inquérito renomeada para "Limitações e riscos"
- GrowNear_Apresentacao.pptx: 8 slides para os 5 minutos (slide de
  recolha de respostas só com título, a completar)
- CLAUDE.md: regista a apresentação e a proposta de valor em português

Co-Authored-By: Claude Opus 5.5 <noreply@anthropic.com>
</commit_message>
<xml_diff>
--- a/Files/GrowNear_Relatorio.docx
+++ b/Files/GrowNear_Relatorio.docx
@@ -209,6 +209,288 @@
     </w:p>
     <w:p>
       <w:pPr>
+        <w:spacing w:after="0" w:line="240" w:lineRule="auto"/>
+        <w:textAlignment w:val="baseline"/>
+        <w:rPr>
+          <w:rFonts w:eastAsia="Times New Roman" w:cs="Noto Sans"/>
+          <w:kern w:val="0"/>
+          <w:sz w:val="28"/>
+          <w:szCs w:val="28"/>
+          <w:lang w:val="pt-PT"/>
+          <w14:ligatures w14:val="none"/>
+        </w:rPr>
+      </w:pPr>
+    </w:p>
+    <w:p>
+      <w:pPr>
+        <w:spacing w:after="0" w:line="240" w:lineRule="auto"/>
+        <w:textAlignment w:val="baseline"/>
+        <w:rPr>
+          <w:rFonts w:eastAsia="Times New Roman" w:cs="Noto Sans"/>
+          <w:kern w:val="0"/>
+          <w:sz w:val="28"/>
+          <w:szCs w:val="28"/>
+          <w:lang w:val="pt-PT"/>
+          <w14:ligatures w14:val="none"/>
+        </w:rPr>
+      </w:pPr>
+    </w:p>
+    <w:p>
+      <w:pPr>
+        <w:spacing w:before="0" w:after="40"/>
+        <w:jc w:val="center"/>
+        <w:textAlignment w:val="baseline"/>
+        <w:rPr>
+          <w:rFonts w:eastAsia="Times New Roman" w:cs="Noto Sans"/>
+          <w:b/>
+          <w:bCs/>
+          <w:kern w:val="36"/>
+          <w:sz w:val="28"/>
+          <w:szCs w:val="28"/>
+          <w:lang w:val="pt-PT"/>
+          <w14:ligatures w14:val="none"/>
+        </w:rPr>
+      </w:pPr>
+      <w:r>
+        <w:rPr>
+          <w:rFonts w:eastAsia="Times New Roman" w:cs="Noto Sans"/>
+          <w:b/>
+          <w:bCs/>
+          <w:kern w:val="36"/>
+          <w:sz w:val="24"/>
+          <w:szCs w:val="24"/>
+          <w:lang w:val="pt-PT"/>
+          <w14:ligatures w14:val="none"/>
+        </w:rPr>
+        <w:t xml:space="preserve">Empreendedorismo e Inovação (INOVEL)</w:t>
+      </w:r>
+    </w:p>
+    <w:p>
+      <w:pPr>
+        <w:spacing w:before="0" w:after="40"/>
+        <w:jc w:val="center"/>
+        <w:textAlignment w:val="baseline"/>
+        <w:rPr>
+          <w:rFonts w:eastAsia="Times New Roman" w:cs="Noto Sans"/>
+          <w:b/>
+          <w:bCs/>
+          <w:kern w:val="36"/>
+          <w:sz w:val="28"/>
+          <w:szCs w:val="28"/>
+          <w:lang w:val="pt-PT"/>
+          <w14:ligatures w14:val="none"/>
+        </w:rPr>
+      </w:pPr>
+      <w:r>
+        <w:rPr>
+          <w:rFonts w:eastAsia="Times New Roman" w:cs="Noto Sans"/>
+          <w:kern w:val="36"/>
+          <w:sz w:val="24"/>
+          <w:szCs w:val="24"/>
+          <w:lang w:val="pt-PT"/>
+          <w14:ligatures w14:val="none"/>
+        </w:rPr>
+        <w:t xml:space="preserve">Instituto Superior de Engenharia do Porto · 2025/2026</w:t>
+      </w:r>
+    </w:p>
+    <w:p>
+      <w:pPr>
+        <w:spacing w:after="0" w:line="240" w:lineRule="auto"/>
+        <w:textAlignment w:val="baseline"/>
+        <w:rPr>
+          <w:rFonts w:eastAsia="Times New Roman" w:cs="Noto Sans"/>
+          <w:kern w:val="0"/>
+          <w:sz w:val="28"/>
+          <w:szCs w:val="28"/>
+          <w:lang w:val="pt-PT"/>
+          <w14:ligatures w14:val="none"/>
+        </w:rPr>
+      </w:pPr>
+    </w:p>
+    <w:p>
+      <w:pPr>
+        <w:spacing w:before="0" w:after="40"/>
+        <w:jc w:val="center"/>
+        <w:textAlignment w:val="baseline"/>
+        <w:rPr>
+          <w:rFonts w:eastAsia="Times New Roman" w:cs="Noto Sans"/>
+          <w:b/>
+          <w:bCs/>
+          <w:kern w:val="36"/>
+          <w:sz w:val="28"/>
+          <w:szCs w:val="28"/>
+          <w:lang w:val="pt-PT"/>
+          <w14:ligatures w14:val="none"/>
+        </w:rPr>
+      </w:pPr>
+      <w:r>
+        <w:rPr>
+          <w:rFonts w:eastAsia="Times New Roman" w:cs="Noto Sans"/>
+          <w:b/>
+          <w:bCs/>
+          <w:kern w:val="36"/>
+          <w:sz w:val="24"/>
+          <w:szCs w:val="24"/>
+          <w:lang w:val="pt-PT"/>
+          <w14:ligatures w14:val="none"/>
+        </w:rPr>
+        <w:t xml:space="preserve">Grupo</w:t>
+      </w:r>
+    </w:p>
+    <w:p>
+      <w:pPr>
+        <w:spacing w:before="0" w:after="40"/>
+        <w:jc w:val="center"/>
+        <w:textAlignment w:val="baseline"/>
+        <w:rPr>
+          <w:rFonts w:eastAsia="Times New Roman" w:cs="Noto Sans"/>
+          <w:b/>
+          <w:bCs/>
+          <w:kern w:val="36"/>
+          <w:sz w:val="28"/>
+          <w:szCs w:val="28"/>
+          <w:lang w:val="pt-PT"/>
+          <w14:ligatures w14:val="none"/>
+        </w:rPr>
+      </w:pPr>
+      <w:r>
+        <w:rPr>
+          <w:rFonts w:eastAsia="Times New Roman" w:cs="Noto Sans"/>
+          <w:kern w:val="36"/>
+          <w:sz w:val="24"/>
+          <w:szCs w:val="24"/>
+          <w:lang w:val="pt-PT"/>
+          <w14:ligatures w14:val="none"/>
+        </w:rPr>
+        <w:t xml:space="preserve">Bruno Lopes – 1240441</w:t>
+      </w:r>
+    </w:p>
+    <w:p>
+      <w:pPr>
+        <w:spacing w:before="0" w:after="40"/>
+        <w:jc w:val="center"/>
+        <w:textAlignment w:val="baseline"/>
+        <w:rPr>
+          <w:rFonts w:eastAsia="Times New Roman" w:cs="Noto Sans"/>
+          <w:b/>
+          <w:bCs/>
+          <w:kern w:val="36"/>
+          <w:sz w:val="28"/>
+          <w:szCs w:val="28"/>
+          <w:lang w:val="pt-PT"/>
+          <w14:ligatures w14:val="none"/>
+        </w:rPr>
+      </w:pPr>
+      <w:r>
+        <w:rPr>
+          <w:rFonts w:eastAsia="Times New Roman" w:cs="Noto Sans"/>
+          <w:kern w:val="36"/>
+          <w:sz w:val="24"/>
+          <w:szCs w:val="24"/>
+          <w:lang w:val="pt-PT"/>
+          <w14:ligatures w14:val="none"/>
+        </w:rPr>
+        <w:t xml:space="preserve">Tiago Teixeira – 1240493</w:t>
+      </w:r>
+    </w:p>
+    <w:p>
+      <w:pPr>
+        <w:spacing w:before="0" w:after="40"/>
+        <w:jc w:val="center"/>
+        <w:textAlignment w:val="baseline"/>
+        <w:rPr>
+          <w:rFonts w:eastAsia="Times New Roman" w:cs="Noto Sans"/>
+          <w:b/>
+          <w:bCs/>
+          <w:kern w:val="36"/>
+          <w:sz w:val="28"/>
+          <w:szCs w:val="28"/>
+          <w:lang w:val="pt-PT"/>
+          <w14:ligatures w14:val="none"/>
+        </w:rPr>
+      </w:pPr>
+      <w:r>
+        <w:rPr>
+          <w:rFonts w:eastAsia="Times New Roman" w:cs="Noto Sans"/>
+          <w:kern w:val="36"/>
+          <w:sz w:val="24"/>
+          <w:szCs w:val="24"/>
+          <w:lang w:val="pt-PT"/>
+          <w14:ligatures w14:val="none"/>
+        </w:rPr>
+        <w:t xml:space="preserve">Francisco Peixoto – 1211648</w:t>
+      </w:r>
+    </w:p>
+    <w:p>
+      <w:pPr>
+        <w:spacing w:before="0" w:after="40"/>
+        <w:jc w:val="center"/>
+        <w:textAlignment w:val="baseline"/>
+        <w:rPr>
+          <w:rFonts w:eastAsia="Times New Roman" w:cs="Noto Sans"/>
+          <w:b/>
+          <w:bCs/>
+          <w:kern w:val="36"/>
+          <w:sz w:val="28"/>
+          <w:szCs w:val="28"/>
+          <w:lang w:val="pt-PT"/>
+          <w14:ligatures w14:val="none"/>
+        </w:rPr>
+      </w:pPr>
+      <w:r>
+        <w:rPr>
+          <w:rFonts w:eastAsia="Times New Roman" w:cs="Noto Sans"/>
+          <w:kern w:val="36"/>
+          <w:sz w:val="24"/>
+          <w:szCs w:val="24"/>
+          <w:lang w:val="pt-PT"/>
+          <w14:ligatures w14:val="none"/>
+        </w:rPr>
+        <w:t xml:space="preserve">António Guerra – 1190409</w:t>
+      </w:r>
+    </w:p>
+    <w:p>
+      <w:pPr>
+        <w:spacing w:before="0" w:after="40"/>
+        <w:jc w:val="center"/>
+        <w:textAlignment w:val="baseline"/>
+        <w:rPr>
+          <w:rFonts w:eastAsia="Times New Roman" w:cs="Noto Sans"/>
+          <w:b/>
+          <w:bCs/>
+          <w:kern w:val="36"/>
+          <w:sz w:val="28"/>
+          <w:szCs w:val="28"/>
+          <w:lang w:val="pt-PT"/>
+          <w14:ligatures w14:val="none"/>
+        </w:rPr>
+      </w:pPr>
+      <w:r>
+        <w:rPr>
+          <w:rFonts w:eastAsia="Times New Roman" w:cs="Noto Sans"/>
+          <w:kern w:val="36"/>
+          <w:sz w:val="24"/>
+          <w:szCs w:val="24"/>
+          <w:lang w:val="pt-PT"/>
+          <w14:ligatures w14:val="none"/>
+        </w:rPr>
+        <w:t xml:space="preserve">Luis </w:t>
+      </w:r>
+      <w:r>
+        <w:rPr>
+          <w:rFonts w:eastAsia="Times New Roman" w:cs="Noto Sans"/>
+          <w:kern w:val="36"/>
+          <w:highlight w:val="yellow"/>
+          <w:sz w:val="24"/>
+          <w:szCs w:val="24"/>
+          <w:lang w:val="pt-PT"/>
+          <w14:ligatures w14:val="none"/>
+        </w:rPr>
+        <w:t xml:space="preserve">[apelido] – [n.º]</w:t>
+      </w:r>
+    </w:p>
+    <w:p>
+      <w:pPr>
         <w:rPr>
           <w:rFonts w:eastAsia="Times New Roman" w:cs="Noto Sans"/>
           <w:b/>
@@ -262,6 +544,290 @@
           <w:lang w:val="pt-PT"/>
           <w14:ligatures w14:val="none"/>
         </w:rPr>
+        <w:t xml:space="preserve">Ideia de negócio</w:t>
+      </w:r>
+    </w:p>
+    <w:p>
+      <w:pPr>
+        <w:spacing w:after="0" w:line="240" w:lineRule="auto"/>
+        <w:textAlignment w:val="baseline"/>
+        <w:rPr>
+          <w:rFonts w:eastAsia="Times New Roman" w:cs="Noto Sans"/>
+          <w:kern w:val="0"/>
+          <w:sz w:val="28"/>
+          <w:szCs w:val="28"/>
+          <w:lang w:val="pt-PT"/>
+          <w14:ligatures w14:val="none"/>
+        </w:rPr>
+      </w:pPr>
+    </w:p>
+    <w:p>
+      <w:pPr>
+        <w:spacing w:after="0" w:line="240" w:lineRule="auto"/>
+        <w:textAlignment w:val="baseline"/>
+        <w:rPr>
+          <w:rFonts w:eastAsia="Times New Roman" w:cs="Noto Sans"/>
+          <w:kern w:val="0"/>
+          <w:sz w:val="28"/>
+          <w:szCs w:val="28"/>
+          <w:bdr w:val="none" w:sz="0" w:space="0" w:color="auto" w:frame="1"/>
+          <w:lang w:val="pt-PT"/>
+          <w14:ligatures w14:val="none"/>
+        </w:rPr>
+      </w:pPr>
+      <w:r>
+        <w:rPr>
+          <w:rFonts w:eastAsia="Times New Roman" w:cs="Noto Sans"/>
+          <w:b/>
+          <w:bCs/>
+          <w:kern w:val="0"/>
+          <w:sz w:val="28"/>
+          <w:szCs w:val="28"/>
+          <w:lang w:val="pt-PT"/>
+          <w14:ligatures w14:val="none"/>
+        </w:rPr>
+        <w:t xml:space="preserve">O problema. </w:t>
+      </w:r>
+      <w:r>
+        <w:rPr>
+          <w:rFonts w:eastAsia="Times New Roman" w:cs="Noto Sans"/>
+          <w:kern w:val="0"/>
+          <w:sz w:val="28"/>
+          <w:szCs w:val="28"/>
+          <w:lang w:val="pt-PT"/>
+          <w14:ligatures w14:val="none"/>
+        </w:rPr>
+        <w:t xml:space="preserve">Muitas famílias com horta, pomar, galinheiro ou colmeias produzem mais do que consomem. Como são pequenas quantidades, não compensa ir a uma feira ou montar uma banca, e o excedente acaba oferecido, esquecido ou no lixo. Ao mesmo tempo, há vizinhos que procuram produtos frescos e de origem conhecida e não sabem que estão a poucos minutos de casa.</w:t>
+      </w:r>
+    </w:p>
+    <w:p>
+      <w:pPr>
+        <w:spacing w:after="0" w:line="240" w:lineRule="auto"/>
+        <w:textAlignment w:val="baseline"/>
+        <w:rPr>
+          <w:rFonts w:eastAsia="Times New Roman" w:cs="Noto Sans"/>
+          <w:kern w:val="0"/>
+          <w:sz w:val="28"/>
+          <w:szCs w:val="28"/>
+          <w:lang w:val="pt-PT"/>
+          <w14:ligatures w14:val="none"/>
+        </w:rPr>
+      </w:pPr>
+    </w:p>
+    <w:p>
+      <w:pPr>
+        <w:spacing w:after="0" w:line="240" w:lineRule="auto"/>
+        <w:textAlignment w:val="baseline"/>
+        <w:rPr>
+          <w:rFonts w:eastAsia="Times New Roman" w:cs="Noto Sans"/>
+          <w:kern w:val="0"/>
+          <w:sz w:val="28"/>
+          <w:szCs w:val="28"/>
+          <w:bdr w:val="none" w:sz="0" w:space="0" w:color="auto" w:frame="1"/>
+          <w:lang w:val="pt-PT"/>
+          <w14:ligatures w14:val="none"/>
+        </w:rPr>
+      </w:pPr>
+      <w:r>
+        <w:rPr>
+          <w:rFonts w:eastAsia="Times New Roman" w:cs="Noto Sans"/>
+          <w:b/>
+          <w:bCs/>
+          <w:kern w:val="0"/>
+          <w:sz w:val="28"/>
+          <w:szCs w:val="28"/>
+          <w:lang w:val="pt-PT"/>
+          <w14:ligatures w14:val="none"/>
+        </w:rPr>
+        <w:t xml:space="preserve">A solução. </w:t>
+      </w:r>
+      <w:r>
+        <w:rPr>
+          <w:rFonts w:eastAsia="Times New Roman" w:cs="Noto Sans"/>
+          <w:kern w:val="0"/>
+          <w:sz w:val="28"/>
+          <w:szCs w:val="28"/>
+          <w:lang w:val="pt-PT"/>
+          <w14:ligatures w14:val="none"/>
+        </w:rPr>
+        <w:t xml:space="preserve">A GrowNear é uma app marketplace que liga estes pequenos produtores não profissionais a compradores da mesma zona. O produtor anuncia o que tem; o comprador vê num mapa o que está disponível perto de si, reserva na app e recolhe em casa do produtor ou num ponto de recolha (um café ou uma mercearia). Não há entrega ao domicílio.</w:t>
+      </w:r>
+    </w:p>
+    <w:p>
+      <w:pPr>
+        <w:spacing w:after="0" w:line="240" w:lineRule="auto"/>
+        <w:textAlignment w:val="baseline"/>
+        <w:rPr>
+          <w:rFonts w:eastAsia="Times New Roman" w:cs="Noto Sans"/>
+          <w:kern w:val="0"/>
+          <w:sz w:val="28"/>
+          <w:szCs w:val="28"/>
+          <w:lang w:val="pt-PT"/>
+          <w14:ligatures w14:val="none"/>
+        </w:rPr>
+      </w:pPr>
+    </w:p>
+    <w:p>
+      <w:pPr>
+        <w:spacing w:after="0" w:line="240" w:lineRule="auto"/>
+        <w:textAlignment w:val="baseline"/>
+        <w:rPr>
+          <w:rFonts w:eastAsia="Times New Roman" w:cs="Noto Sans"/>
+          <w:kern w:val="0"/>
+          <w:sz w:val="28"/>
+          <w:szCs w:val="28"/>
+          <w:bdr w:val="none" w:sz="0" w:space="0" w:color="auto" w:frame="1"/>
+          <w:lang w:val="pt-PT"/>
+          <w14:ligatures w14:val="none"/>
+        </w:rPr>
+      </w:pPr>
+      <w:r>
+        <w:rPr>
+          <w:rFonts w:eastAsia="Times New Roman" w:cs="Noto Sans"/>
+          <w:b/>
+          <w:bCs/>
+          <w:kern w:val="0"/>
+          <w:sz w:val="28"/>
+          <w:szCs w:val="28"/>
+          <w:lang w:val="pt-PT"/>
+          <w14:ligatures w14:val="none"/>
+        </w:rPr>
+        <w:t xml:space="preserve">Como ganha dinheiro. </w:t>
+      </w:r>
+      <w:r>
+        <w:rPr>
+          <w:rFonts w:eastAsia="Times New Roman" w:cs="Noto Sans"/>
+          <w:kern w:val="0"/>
+          <w:sz w:val="28"/>
+          <w:szCs w:val="28"/>
+          <w:lang w:val="pt-PT"/>
+          <w14:ligatures w14:val="none"/>
+        </w:rPr>
+        <w:t xml:space="preserve">Vender é grátis. O comprador paga uma taxa de serviço de 0,50 € + 5 % em cada compra paga na app (1,00 € numa encomenda de 10 €), que garante o reembolso se o produto não corresponder ao anunciado.</w:t>
+      </w:r>
+    </w:p>
+    <w:p>
+      <w:pPr>
+        <w:spacing w:after="0" w:line="240" w:lineRule="auto"/>
+        <w:textAlignment w:val="baseline"/>
+        <w:rPr>
+          <w:rFonts w:eastAsia="Times New Roman" w:cs="Noto Sans"/>
+          <w:kern w:val="0"/>
+          <w:sz w:val="28"/>
+          <w:szCs w:val="28"/>
+          <w:lang w:val="pt-PT"/>
+          <w14:ligatures w14:val="none"/>
+        </w:rPr>
+      </w:pPr>
+    </w:p>
+    <w:p>
+      <w:pPr>
+        <w:spacing w:after="0" w:line="240" w:lineRule="auto"/>
+        <w:textAlignment w:val="baseline"/>
+        <w:rPr>
+          <w:rFonts w:eastAsia="Times New Roman" w:cs="Noto Sans"/>
+          <w:kern w:val="0"/>
+          <w:sz w:val="28"/>
+          <w:szCs w:val="28"/>
+          <w:bdr w:val="none" w:sz="0" w:space="0" w:color="auto" w:frame="1"/>
+          <w:lang w:val="pt-PT"/>
+          <w14:ligatures w14:val="none"/>
+        </w:rPr>
+      </w:pPr>
+      <w:r>
+        <w:rPr>
+          <w:rFonts w:eastAsia="Times New Roman" w:cs="Noto Sans"/>
+          <w:b/>
+          <w:bCs/>
+          <w:kern w:val="0"/>
+          <w:sz w:val="28"/>
+          <w:szCs w:val="28"/>
+          <w:lang w:val="pt-PT"/>
+          <w14:ligatures w14:val="none"/>
+        </w:rPr>
+        <w:t xml:space="preserve">O que a distingue. </w:t>
+      </w:r>
+      <w:r>
+        <w:rPr>
+          <w:rFonts w:eastAsia="Times New Roman" w:cs="Noto Sans"/>
+          <w:kern w:val="0"/>
+          <w:sz w:val="28"/>
+          <w:szCs w:val="28"/>
+          <w:lang w:val="pt-PT"/>
+          <w14:ligatures w14:val="none"/>
+        </w:rPr>
+        <w:t xml:space="preserve">Ao contrário das feiras, das lojas de produtos biológicos e dos grupos de anúncios online, a GrowNear foca-se nos excedentes de quem não vive da produção: sem burocracia nem intermediários, com descoberta por mapa, avaliações entre vizinhos e alertas "avisem-me" para os produtos da época.</w:t>
+      </w:r>
+    </w:p>
+    <w:p>
+      <w:pPr>
+        <w:spacing w:after="0" w:line="240" w:lineRule="auto"/>
+        <w:textAlignment w:val="baseline"/>
+        <w:rPr>
+          <w:rFonts w:eastAsia="Times New Roman" w:cs="Noto Sans"/>
+          <w:kern w:val="0"/>
+          <w:sz w:val="28"/>
+          <w:szCs w:val="28"/>
+          <w:lang w:val="pt-PT"/>
+          <w14:ligatures w14:val="none"/>
+        </w:rPr>
+      </w:pPr>
+    </w:p>
+    <w:p>
+      <w:pPr>
+        <w:rPr>
+          <w:rFonts w:eastAsia="Times New Roman" w:cs="Noto Sans"/>
+          <w:b/>
+          <w:bCs/>
+          <w:kern w:val="36"/>
+          <w:sz w:val="48"/>
+          <w:szCs w:val="48"/>
+          <w:lang w:val="pt-PT"/>
+          <w14:ligatures w14:val="none"/>
+        </w:rPr>
+      </w:pPr>
+      <w:r>
+        <w:rPr>
+          <w:rFonts w:eastAsia="Times New Roman" w:cs="Noto Sans"/>
+          <w:b/>
+          <w:bCs/>
+          <w:kern w:val="36"/>
+          <w:sz w:val="48"/>
+          <w:szCs w:val="48"/>
+          <w:lang w:val="pt-PT"/>
+          <w14:ligatures w14:val="none"/>
+        </w:rPr>
+        <w:br w:type="page"/>
+      </w:r>
+    </w:p>
+    <w:p>
+      <w:pPr>
+        <w:spacing w:before="120" w:after="120" w:line="330" w:lineRule="atLeast"/>
+        <w:jc w:val="center"/>
+        <w:textAlignment w:val="baseline"/>
+        <w:outlineLvl w:val="0"/>
+        <w:rPr>
+          <w:rFonts w:eastAsia="Times New Roman" w:cs="Noto Sans"/>
+          <w:b/>
+          <w:bCs/>
+          <w:kern w:val="36"/>
+          <w:sz w:val="36"/>
+          <w:szCs w:val="36"/>
+          <w:lang w:val="pt-PT"/>
+          <w14:ligatures w14:val="none"/>
+        </w:rPr>
+      </w:pPr>
+      <w:r>
+        <w:rPr>
+          <w:rFonts w:eastAsia="Times New Roman" w:cs="Noto Sans"/>
+          <w:b/>
+          <w:bCs/>
+          <w:kern w:val="36"/>
+          <w:sz w:val="36"/>
+          <w:szCs w:val="36"/>
+          <w:lang w:val="pt-PT"/>
+          <w14:ligatures w14:val="none"/>
+        </w:rPr>
         <w:lastRenderedPageBreak/>
         <w:t>Missão e Visão</w:t>
       </w:r>
@@ -539,11 +1105,13 @@
       <w:r>
         <w:rPr>
           <w:rFonts w:cs="Noto Sans"/>
+          <w:b/>
+          <w:bCs/>
           <w:sz w:val="28"/>
           <w:szCs w:val="28"/>
           <w:lang w:val="pt-PT"/>
         </w:rPr>
-        <w:t>For:</w:t>
+        <w:t xml:space="preserve">Para </w:t>
       </w:r>
       <w:r>
         <w:rPr>
@@ -552,16 +1120,47 @@
           <w:szCs w:val="28"/>
           <w:lang w:val="pt-PT"/>
         </w:rPr>
-        <w:t xml:space="preserve"> </w:t>
+        <w:t xml:space="preserve">pequenos produtores não profissionais com excedentes da horta, do pomar, do galinheiro ou das colmeias, e compradores da zona que procuram produtos locais frescos,</w:t>
       </w:r>
-      <w:r>
+    </w:p>
+    <w:p>
+      <w:pPr>
         <w:rPr>
           <w:rFonts w:cs="Noto Sans"/>
           <w:sz w:val="28"/>
           <w:szCs w:val="28"/>
           <w:lang w:val="pt-PT"/>
         </w:rPr>
-        <w:t>Pequenos Produtores, compradores locais.</w:t>
+      </w:pPr>
+    </w:p>
+    <w:p>
+      <w:pPr>
+        <w:rPr>
+          <w:rFonts w:cs="Noto Sans"/>
+          <w:sz w:val="28"/>
+          <w:szCs w:val="28"/>
+          <w:lang w:val="pt-PT"/>
+        </w:rPr>
+      </w:pPr>
+      <w:r>
+        <w:rPr>
+          <w:rFonts w:cs="Noto Sans"/>
+          <w:b/>
+          <w:bCs/>
+          <w:sz w:val="28"/>
+          <w:szCs w:val="28"/>
+          <w:lang w:val="pt-PT"/>
+        </w:rPr>
+        <w:t xml:space="preserve">Que </w:t>
+      </w:r>
+      <w:r>
+        <w:rPr>
+          <w:rFonts w:cs="Noto Sans"/>
+          <w:sz w:val="28"/>
+          <w:szCs w:val="28"/>
+          <w:lang w:val="pt-PT"/>
+        </w:rPr>
+        <w:t xml:space="preserve">têm dificuldade em escoar pequenas quantidades sem burocracia nem intermediários (produtores), ou querem produtos frescos e naturais, de origem conhecida, perto de casa (compradores),</w:t>
       </w:r>
     </w:p>
     <w:p>
@@ -580,9 +1179,19 @@
           <w:rFonts w:cs="Noto Sans"/>
           <w:sz w:val="28"/>
           <w:szCs w:val="28"/>
+        </w:rPr>
+      </w:pPr>
+      <w:r>
+        <w:rPr>
+          <w:rFonts w:cs="Noto Sans"/>
+          <w:b/>
+          <w:bCs/>
+          <w:sz w:val="28"/>
+          <w:szCs w:val="28"/>
           <w:lang w:val="pt-PT"/>
         </w:rPr>
-      </w:pPr>
+        <w:t xml:space="preserve">A </w:t>
+      </w:r>
       <w:r>
         <w:rPr>
           <w:rFonts w:cs="Noto Sans"/>
@@ -590,7 +1199,36 @@
           <w:szCs w:val="28"/>
           <w:lang w:val="pt-PT"/>
         </w:rPr>
-        <w:t>Who:</w:t>
+        <w:t xml:space="preserve">GrowNear é uma app marketplace local, com descoberta por mapa,</w:t>
+      </w:r>
+    </w:p>
+    <w:p>
+      <w:pPr>
+        <w:rPr>
+          <w:rFonts w:cs="Noto Sans"/>
+          <w:sz w:val="28"/>
+          <w:szCs w:val="28"/>
+        </w:rPr>
+      </w:pPr>
+    </w:p>
+    <w:p>
+      <w:pPr>
+        <w:rPr>
+          <w:rFonts w:cs="Noto Sans"/>
+          <w:sz w:val="28"/>
+          <w:szCs w:val="28"/>
+        </w:rPr>
+      </w:pPr>
+      <w:r>
+        <w:rPr>
+          <w:rFonts w:cs="Noto Sans"/>
+          <w:b/>
+          <w:bCs/>
+          <w:sz w:val="28"/>
+          <w:szCs w:val="28"/>
+          <w:lang w:val="pt-PT"/>
+        </w:rPr>
+        <w:t xml:space="preserve">Que </w:t>
       </w:r>
       <w:r>
         <w:rPr>
@@ -599,7 +1237,41 @@
           <w:szCs w:val="28"/>
           <w:lang w:val="pt-PT"/>
         </w:rPr>
-        <w:t xml:space="preserve"> P</w:t>
+        <w:t xml:space="preserve">liga vizinhos: o comprador encontra o que há perto, reserva e paga na app, e recolhe em casa do produtor ou num ponto de recolha.</w:t>
+      </w:r>
+    </w:p>
+    <w:p>
+      <w:pPr>
+        <w:spacing w:after="0" w:line="240" w:lineRule="auto"/>
+        <w:textAlignment w:val="baseline"/>
+        <w:rPr>
+          <w:rFonts w:eastAsia="Times New Roman" w:cs="Noto Sans"/>
+          <w:kern w:val="0"/>
+          <w:sz w:val="28"/>
+          <w:szCs w:val="28"/>
+          <w:lang w:val="pt-PT"/>
+          <w14:ligatures w14:val="none"/>
+        </w:rPr>
+      </w:pPr>
+    </w:p>
+    <w:p>
+      <w:pPr>
+        <w:rPr>
+          <w:rFonts w:cs="Noto Sans"/>
+          <w:sz w:val="28"/>
+          <w:szCs w:val="28"/>
+        </w:rPr>
+      </w:pPr>
+      <w:r>
+        <w:rPr>
+          <w:rFonts w:cs="Noto Sans"/>
+          <w:b/>
+          <w:bCs/>
+          <w:sz w:val="28"/>
+          <w:szCs w:val="28"/>
+          <w:lang w:val="pt-PT"/>
+        </w:rPr>
+        <w:t xml:space="preserve">Ao contrário de </w:t>
       </w:r>
       <w:r>
         <w:rPr>
@@ -608,7 +1280,7 @@
           <w:szCs w:val="28"/>
           <w:lang w:val="pt-PT"/>
         </w:rPr>
-        <w:t>ara produtores locais com dificuldade em escoar produto &amp; para compradores locais interessados e produtos biológicos.</w:t>
+        <w:t xml:space="preserve">feiras e mercados, lojas de produtos biológicos e anúncios online genéricos,</w:t>
       </w:r>
     </w:p>
     <w:p>
@@ -617,7 +1289,6 @@
           <w:rFonts w:cs="Noto Sans"/>
           <w:sz w:val="28"/>
           <w:szCs w:val="28"/>
-          <w:lang w:val="pt-PT"/>
         </w:rPr>
       </w:pPr>
     </w:p>
@@ -632,122 +1303,22 @@
       <w:r>
         <w:rPr>
           <w:rFonts w:cs="Noto Sans"/>
+          <w:b/>
+          <w:bCs/>
           <w:sz w:val="28"/>
           <w:szCs w:val="28"/>
-        </w:rPr>
-        <w:t>The:</w:t>
+          <w:lang w:val="pt-PT"/>
+        </w:rPr>
+        <w:t xml:space="preserve">A nossa solução: </w:t>
       </w:r>
       <w:r>
         <w:rPr>
           <w:rFonts w:cs="Noto Sans"/>
           <w:sz w:val="28"/>
           <w:szCs w:val="28"/>
-        </w:rPr>
-        <w:t xml:space="preserve"> </w:t>
-      </w:r>
-      <w:r>
-        <w:rPr>
-          <w:rFonts w:cs="Noto Sans"/>
-          <w:sz w:val="28"/>
-          <w:szCs w:val="28"/>
-        </w:rPr>
-        <w:t xml:space="preserve">The </w:t>
-      </w:r>
-      <w:proofErr w:type="spellStart"/>
-      <w:r>
-        <w:rPr>
-          <w:rFonts w:cs="Noto Sans"/>
-          <w:sz w:val="28"/>
-          <w:szCs w:val="28"/>
-        </w:rPr>
-        <w:t>GrowNear</w:t>
-      </w:r>
-      <w:proofErr w:type="spellEnd"/>
-      <w:r>
-        <w:rPr>
-          <w:rFonts w:cs="Noto Sans"/>
-          <w:sz w:val="28"/>
-          <w:szCs w:val="28"/>
-        </w:rPr>
-        <w:t xml:space="preserve"> is a marketplace app. </w:t>
-      </w:r>
-    </w:p>
-    <w:p>
-      <w:pPr>
-        <w:rPr>
-          <w:rFonts w:cs="Noto Sans"/>
-          <w:sz w:val="28"/>
-          <w:szCs w:val="28"/>
-        </w:rPr>
-      </w:pPr>
-    </w:p>
-    <w:p>
-      <w:pPr>
-        <w:rPr>
-          <w:rFonts w:cs="Noto Sans"/>
-          <w:sz w:val="28"/>
-          <w:szCs w:val="28"/>
-        </w:rPr>
-      </w:pPr>
-      <w:r>
-        <w:rPr>
-          <w:rFonts w:cs="Noto Sans"/>
-          <w:sz w:val="28"/>
-          <w:szCs w:val="28"/>
-        </w:rPr>
-        <w:t>That: Connects producers and buyers of local goods. Unlike: Farmers markets, generic shops.</w:t>
-      </w:r>
-    </w:p>
-    <w:p>
-      <w:pPr>
-        <w:rPr>
-          <w:rFonts w:cs="Noto Sans"/>
-          <w:sz w:val="28"/>
-          <w:szCs w:val="28"/>
-        </w:rPr>
-      </w:pPr>
-    </w:p>
-    <w:p>
-      <w:pPr>
-        <w:rPr>
-          <w:rFonts w:cs="Noto Sans"/>
-          <w:sz w:val="28"/>
-          <w:szCs w:val="28"/>
-        </w:rPr>
-      </w:pPr>
-      <w:r>
-        <w:rPr>
-          <w:rFonts w:cs="Noto Sans"/>
-          <w:sz w:val="28"/>
-          <w:szCs w:val="28"/>
-        </w:rPr>
-        <w:t>Our Solution:</w:t>
-      </w:r>
-      <w:r>
-        <w:rPr>
-          <w:rFonts w:cs="Noto Sans"/>
-          <w:sz w:val="28"/>
-          <w:szCs w:val="28"/>
-        </w:rPr>
-        <w:t xml:space="preserve"> </w:t>
-      </w:r>
-      <w:proofErr w:type="spellStart"/>
-      <w:r>
-        <w:rPr>
-          <w:rFonts w:cs="Noto Sans"/>
-          <w:sz w:val="28"/>
-          <w:szCs w:val="28"/>
-        </w:rPr>
-        <w:t>GrowNear</w:t>
-      </w:r>
-      <w:proofErr w:type="spellEnd"/>
-      <w:r>
-        <w:rPr>
-          <w:rFonts w:cs="Noto Sans"/>
-          <w:sz w:val="28"/>
-          <w:szCs w:val="28"/>
-        </w:rPr>
-        <w:t xml:space="preserve"> focuses on the surplus of non-professional producers, with no bureaucracy or intermediaries, map-based discovery, "notify me" alerts and optional in-app payment, so buyers pay less than at organic shops and know exactly where their food comes from.</w:t>
+          <w:lang w:val="pt-PT"/>
+        </w:rPr>
+        <w:t xml:space="preserve">a GrowNear foca-se nos excedentes de produtores não profissionais, sem burocracia nem intermediários, com descoberta por mapa, alertas "avisem-me" e pagamento opcional na app, para que o comprador pague menos do que numa loja de produtos biológicos e saiba exatamente de onde vem o que come.</w:t>
       </w:r>
     </w:p>
     <w:p>
@@ -5643,7 +6214,7 @@
                 <w:lang w:val="pt-PT"/>
                 <w14:ligatures w14:val="none"/>
               </w:rPr>
-              <w:t>Cada pergunta pede uma só resposta ("o principal", "o mais importante"). Onde interessam várias opções, usa-se uma grelha Sim/Não</w:t>
+              <w:t xml:space="preserve">Cada pergunta pede uma só resposta ("o principal", "mais provavelmente"). Onde interessam várias opções, usa-se uma grelha Sim/Não</w:t>
             </w:r>
           </w:p>
         </w:tc>
@@ -5805,7 +6376,7 @@
                 <w:lang w:val="pt-PT"/>
                 <w14:ligatures w14:val="none"/>
               </w:rPr>
-              <w:t>Todos respondem a tudo. P2, P24, P26 e P30 permitem separar perfis na análise, sem excluir ninguém na recolha</w:t>
+              <w:t xml:space="preserve">Todos respondem a tudo. P2, P23, P25 e P29 permitem separar perfis na análise, sem excluir ninguém na recolha</w:t>
             </w:r>
           </w:p>
         </w:tc>
@@ -6787,108 +7358,80 @@
                 <w:kern w:val="0"/>
                 <w14:ligatures w14:val="none"/>
               </w:rPr>
-              <w:t>P8 a P9</w:t>
-            </w:r>
-          </w:p>
-        </w:tc>
-        <w:tc>
-          <w:tcPr>
-            <w:tcW w:w="0" w:type="auto"/>
-            <w:tcBorders>
-              <w:top w:val="single" w:sz="6" w:space="0" w:color="auto"/>
-              <w:left w:val="single" w:sz="6" w:space="0" w:color="auto"/>
-              <w:bottom w:val="single" w:sz="6" w:space="0" w:color="auto"/>
-              <w:right w:val="single" w:sz="6" w:space="0" w:color="auto"/>
-            </w:tcBorders>
-            <w:tcMar>
-              <w:top w:w="60" w:type="dxa"/>
-              <w:left w:w="120" w:type="dxa"/>
-              <w:bottom w:w="60" w:type="dxa"/>
-              <w:right w:w="120" w:type="dxa"/>
-            </w:tcMar>
-            <w:hideMark/>
-          </w:tcPr>
-          <w:p>
-            <w:pPr>
-              <w:spacing w:after="0" w:line="240" w:lineRule="auto"/>
-              <w:rPr>
-                <w:rFonts w:eastAsia="Times New Roman" w:cs="Noto Sans"/>
-                <w:kern w:val="0"/>
-                <w14:ligatures w14:val="none"/>
-              </w:rPr>
-            </w:pPr>
-            <w:r>
-              <w:rPr>
-                <w:rFonts w:eastAsia="Times New Roman" w:cs="Noto Sans"/>
-                <w:kern w:val="0"/>
-                <w14:ligatures w14:val="none"/>
-              </w:rPr>
-              <w:t>2</w:t>
-            </w:r>
-          </w:p>
-        </w:tc>
-        <w:tc>
-          <w:tcPr>
-            <w:tcW w:w="0" w:type="auto"/>
-            <w:tcBorders>
-              <w:top w:val="single" w:sz="6" w:space="0" w:color="auto"/>
-              <w:left w:val="single" w:sz="6" w:space="0" w:color="auto"/>
-              <w:bottom w:val="single" w:sz="6" w:space="0" w:color="auto"/>
-              <w:right w:val="single" w:sz="6" w:space="0" w:color="auto"/>
-            </w:tcBorders>
-            <w:tcMar>
-              <w:top w:w="60" w:type="dxa"/>
-              <w:left w:w="120" w:type="dxa"/>
-              <w:bottom w:w="60" w:type="dxa"/>
-              <w:right w:w="120" w:type="dxa"/>
-            </w:tcMar>
-            <w:hideMark/>
-          </w:tcPr>
-          <w:p>
-            <w:pPr>
-              <w:spacing w:after="0" w:line="240" w:lineRule="auto"/>
-              <w:rPr>
-                <w:rFonts w:eastAsia="Times New Roman" w:cs="Noto Sans"/>
-                <w:kern w:val="0"/>
-                <w14:ligatures w14:val="none"/>
-              </w:rPr>
-            </w:pPr>
-            <w:r>
-              <w:rPr>
-                <w:rFonts w:eastAsia="Times New Roman" w:cs="Noto Sans"/>
-                <w:kern w:val="0"/>
-                <w14:ligatures w14:val="none"/>
-              </w:rPr>
-              <w:t xml:space="preserve">Escala 1 a 5, </w:t>
-            </w:r>
-            <w:proofErr w:type="spellStart"/>
-            <w:r>
-              <w:rPr>
-                <w:rFonts w:eastAsia="Times New Roman" w:cs="Noto Sans"/>
-                <w:kern w:val="0"/>
-                <w14:ligatures w14:val="none"/>
-              </w:rPr>
-              <w:t>escolha</w:t>
-            </w:r>
-            <w:proofErr w:type="spellEnd"/>
-            <w:r>
-              <w:rPr>
-                <w:rFonts w:eastAsia="Times New Roman" w:cs="Noto Sans"/>
-                <w:kern w:val="0"/>
-                <w14:ligatures w14:val="none"/>
-              </w:rPr>
-              <w:t xml:space="preserve"> </w:t>
-            </w:r>
-            <w:proofErr w:type="spellStart"/>
-            <w:r>
-              <w:rPr>
-                <w:rFonts w:eastAsia="Times New Roman" w:cs="Noto Sans"/>
-                <w:kern w:val="0"/>
-                <w14:ligatures w14:val="none"/>
-              </w:rPr>
-              <w:t>única</w:t>
-            </w:r>
-            <w:proofErr w:type="spellEnd"/>
+              <w:t xml:space="preserve">P8</w:t>
+            </w:r>
+          </w:p>
+        </w:tc>
+        <w:tc>
+          <w:tcPr>
+            <w:tcW w:w="0" w:type="auto"/>
+            <w:tcBorders>
+              <w:top w:val="single" w:sz="6" w:space="0" w:color="auto"/>
+              <w:left w:val="single" w:sz="6" w:space="0" w:color="auto"/>
+              <w:bottom w:val="single" w:sz="6" w:space="0" w:color="auto"/>
+              <w:right w:val="single" w:sz="6" w:space="0" w:color="auto"/>
+            </w:tcBorders>
+            <w:tcMar>
+              <w:top w:w="60" w:type="dxa"/>
+              <w:left w:w="120" w:type="dxa"/>
+              <w:bottom w:w="60" w:type="dxa"/>
+              <w:right w:w="120" w:type="dxa"/>
+            </w:tcMar>
+            <w:hideMark/>
+          </w:tcPr>
+          <w:p>
+            <w:pPr>
+              <w:spacing w:after="0" w:line="240" w:lineRule="auto"/>
+              <w:rPr>
+                <w:rFonts w:eastAsia="Times New Roman" w:cs="Noto Sans"/>
+                <w:kern w:val="0"/>
+                <w14:ligatures w14:val="none"/>
+              </w:rPr>
+            </w:pPr>
+            <w:r>
+              <w:rPr>
+                <w:rFonts w:eastAsia="Times New Roman" w:cs="Noto Sans"/>
+                <w:kern w:val="0"/>
+                <w14:ligatures w14:val="none"/>
+              </w:rPr>
+              <w:t xml:space="preserve">1</w:t>
+            </w:r>
+          </w:p>
+        </w:tc>
+        <w:tc>
+          <w:tcPr>
+            <w:tcW w:w="0" w:type="auto"/>
+            <w:tcBorders>
+              <w:top w:val="single" w:sz="6" w:space="0" w:color="auto"/>
+              <w:left w:val="single" w:sz="6" w:space="0" w:color="auto"/>
+              <w:bottom w:val="single" w:sz="6" w:space="0" w:color="auto"/>
+              <w:right w:val="single" w:sz="6" w:space="0" w:color="auto"/>
+            </w:tcBorders>
+            <w:tcMar>
+              <w:top w:w="60" w:type="dxa"/>
+              <w:left w:w="120" w:type="dxa"/>
+              <w:bottom w:w="60" w:type="dxa"/>
+              <w:right w:w="120" w:type="dxa"/>
+            </w:tcMar>
+            <w:hideMark/>
+          </w:tcPr>
+          <w:p>
+            <w:pPr>
+              <w:spacing w:after="0" w:line="240" w:lineRule="auto"/>
+              <w:rPr>
+                <w:rFonts w:eastAsia="Times New Roman" w:cs="Noto Sans"/>
+                <w:kern w:val="0"/>
+                <w14:ligatures w14:val="none"/>
+              </w:rPr>
+            </w:pPr>
+            <w:r>
+              <w:rPr>
+                <w:rFonts w:eastAsia="Times New Roman" w:cs="Noto Sans"/>
+                <w:kern w:val="0"/>
+                <w14:ligatures w14:val="none"/>
+              </w:rPr>
+              <w:t xml:space="preserve">Escala 1 a 5</w:t>
+            </w:r>
           </w:p>
         </w:tc>
       </w:tr>
@@ -7025,7 +7568,7 @@
                 <w:kern w:val="0"/>
                 <w14:ligatures w14:val="none"/>
               </w:rPr>
-              <w:t>P10 a P12</w:t>
+              <w:t xml:space="preserve">P9 a P11</w:t>
             </w:r>
           </w:p>
         </w:tc>
@@ -7245,7 +7788,7 @@
                 <w:kern w:val="0"/>
                 <w14:ligatures w14:val="none"/>
               </w:rPr>
-              <w:t>P13 a P17</w:t>
+              <w:t xml:space="preserve">P12 a P16</w:t>
             </w:r>
           </w:p>
         </w:tc>
@@ -7457,7 +8000,7 @@
                 <w:kern w:val="0"/>
                 <w14:ligatures w14:val="none"/>
               </w:rPr>
-              <w:t>P18 a P19</w:t>
+              <w:t xml:space="preserve">P17 a P18</w:t>
             </w:r>
           </w:p>
         </w:tc>
@@ -7686,7 +8229,7 @@
                 <w:kern w:val="0"/>
                 <w14:ligatures w14:val="none"/>
               </w:rPr>
-              <w:t>P20 a P23</w:t>
+              <w:t xml:space="preserve">P19 a P22</w:t>
             </w:r>
           </w:p>
         </w:tc>
@@ -7906,7 +8449,7 @@
                 <w:kern w:val="0"/>
                 <w14:ligatures w14:val="none"/>
               </w:rPr>
-              <w:t>P24 a P30</w:t>
+              <w:t xml:space="preserve">P23 a P29</w:t>
             </w:r>
           </w:p>
         </w:tc>
@@ -8130,13 +8673,10 @@
             <w:r>
               <w:rPr>
                 <w:rFonts w:eastAsia="Times New Roman" w:cs="Noto Sans"/>
-                <w:b/>
-                <w:bCs/>
-                <w:kern w:val="0"/>
-                <w:bdr w:val="none" w:sz="0" w:space="0" w:color="auto" w:frame="1"/>
-                <w14:ligatures w14:val="none"/>
-              </w:rPr>
-              <w:t>30</w:t>
+                <w:kern w:val="0"/>
+                <w14:ligatures w14:val="none"/>
+              </w:rPr>
+              <w:t xml:space="preserve">29</w:t>
             </w:r>
           </w:p>
         </w:tc>
@@ -8363,7 +8903,7 @@
           <w:lang w:val="pt-PT"/>
           <w14:ligatures w14:val="none"/>
         </w:rPr>
-        <w:t>Somos estudantes do ISEP e estamos a desenvolver um projeto na unidade curricular de Empreendedorismo e Inovação. Este questionário é sobre hábitos de compra de frutas, legumes e outros produtos locais. É anónimo, demora cerca de 6 minutos e as respostas são usadas apenas para fins académicos. Não há respostas certas ou erradas.</w:t>
+        <w:t xml:space="preserve">Olá! Somos a GrowNear e queremos aproximar quem produz de quem compra. Para criarmos algo realmente útil, queremos conhecer os seus hábitos de compra de frutas, legumes e outros produtos locais. O questionário é anónimo e demora cerca de 6 minutos. As respostas são usadas apenas neste estudo de mercado. Não há respostas certas ou erradas: só queremos saber como compra hoje. Obrigado pela ajuda!</w:t>
       </w:r>
     </w:p>
     <w:p>
@@ -10384,197 +10924,6 @@
           </w:p>
         </w:tc>
       </w:tr>
-      <w:tr>
-        <w:tc>
-          <w:tcPr>
-            <w:tcW w:w="0" w:type="auto"/>
-            <w:tcBorders>
-              <w:top w:val="single" w:sz="6" w:space="0" w:color="auto"/>
-              <w:left w:val="single" w:sz="6" w:space="0" w:color="auto"/>
-              <w:bottom w:val="single" w:sz="6" w:space="0" w:color="auto"/>
-              <w:right w:val="single" w:sz="6" w:space="0" w:color="auto"/>
-            </w:tcBorders>
-            <w:tcMar>
-              <w:top w:w="60" w:type="dxa"/>
-              <w:left w:w="120" w:type="dxa"/>
-              <w:bottom w:w="60" w:type="dxa"/>
-              <w:right w:w="120" w:type="dxa"/>
-            </w:tcMar>
-            <w:hideMark/>
-          </w:tcPr>
-          <w:p>
-            <w:pPr>
-              <w:spacing w:after="0" w:line="240" w:lineRule="auto"/>
-              <w:rPr>
-                <w:rFonts w:eastAsia="Times New Roman" w:cs="Noto Sans"/>
-                <w:kern w:val="0"/>
-                <w14:ligatures w14:val="none"/>
-              </w:rPr>
-            </w:pPr>
-            <w:r>
-              <w:rPr>
-                <w:rFonts w:eastAsia="Times New Roman" w:cs="Noto Sans"/>
-                <w:kern w:val="0"/>
-                <w14:ligatures w14:val="none"/>
-              </w:rPr>
-              <w:t>P9</w:t>
-            </w:r>
-          </w:p>
-        </w:tc>
-        <w:tc>
-          <w:tcPr>
-            <w:tcW w:w="0" w:type="auto"/>
-            <w:tcBorders>
-              <w:top w:val="single" w:sz="6" w:space="0" w:color="auto"/>
-              <w:left w:val="single" w:sz="6" w:space="0" w:color="auto"/>
-              <w:bottom w:val="single" w:sz="6" w:space="0" w:color="auto"/>
-              <w:right w:val="single" w:sz="6" w:space="0" w:color="auto"/>
-            </w:tcBorders>
-            <w:tcMar>
-              <w:top w:w="60" w:type="dxa"/>
-              <w:left w:w="120" w:type="dxa"/>
-              <w:bottom w:w="60" w:type="dxa"/>
-              <w:right w:w="120" w:type="dxa"/>
-            </w:tcMar>
-            <w:hideMark/>
-          </w:tcPr>
-          <w:p>
-            <w:pPr>
-              <w:spacing w:after="0" w:line="240" w:lineRule="auto"/>
-              <w:rPr>
-                <w:rFonts w:eastAsia="Times New Roman" w:cs="Noto Sans"/>
-                <w:kern w:val="0"/>
-                <w:lang w:val="pt-PT"/>
-                <w14:ligatures w14:val="none"/>
-              </w:rPr>
-            </w:pPr>
-            <w:r>
-              <w:rPr>
-                <w:rFonts w:eastAsia="Times New Roman" w:cs="Noto Sans"/>
-                <w:kern w:val="0"/>
-                <w:lang w:val="pt-PT"/>
-                <w14:ligatures w14:val="none"/>
-              </w:rPr>
-              <w:t>Destes fatores, qual é o </w:t>
-            </w:r>
-            <w:r>
-              <w:rPr>
-                <w:rFonts w:eastAsia="Times New Roman" w:cs="Noto Sans"/>
-                <w:b/>
-                <w:bCs/>
-                <w:kern w:val="0"/>
-                <w:bdr w:val="none" w:sz="0" w:space="0" w:color="auto" w:frame="1"/>
-                <w:lang w:val="pt-PT"/>
-                <w14:ligatures w14:val="none"/>
-              </w:rPr>
-              <w:t>mais importante</w:t>
-            </w:r>
-            <w:r>
-              <w:rPr>
-                <w:rFonts w:eastAsia="Times New Roman" w:cs="Noto Sans"/>
-                <w:kern w:val="0"/>
-                <w:lang w:val="pt-PT"/>
-                <w14:ligatures w14:val="none"/>
-              </w:rPr>
-              <w:t> para si?</w:t>
-            </w:r>
-          </w:p>
-        </w:tc>
-        <w:tc>
-          <w:tcPr>
-            <w:tcW w:w="0" w:type="auto"/>
-            <w:tcBorders>
-              <w:top w:val="single" w:sz="6" w:space="0" w:color="auto"/>
-              <w:left w:val="single" w:sz="6" w:space="0" w:color="auto"/>
-              <w:bottom w:val="single" w:sz="6" w:space="0" w:color="auto"/>
-              <w:right w:val="single" w:sz="6" w:space="0" w:color="auto"/>
-            </w:tcBorders>
-            <w:tcMar>
-              <w:top w:w="60" w:type="dxa"/>
-              <w:left w:w="120" w:type="dxa"/>
-              <w:bottom w:w="60" w:type="dxa"/>
-              <w:right w:w="120" w:type="dxa"/>
-            </w:tcMar>
-            <w:hideMark/>
-          </w:tcPr>
-          <w:p>
-            <w:pPr>
-              <w:spacing w:after="0" w:line="240" w:lineRule="auto"/>
-              <w:rPr>
-                <w:rFonts w:eastAsia="Times New Roman" w:cs="Noto Sans"/>
-                <w:kern w:val="0"/>
-                <w14:ligatures w14:val="none"/>
-              </w:rPr>
-            </w:pPr>
-            <w:proofErr w:type="spellStart"/>
-            <w:r>
-              <w:rPr>
-                <w:rFonts w:eastAsia="Times New Roman" w:cs="Noto Sans"/>
-                <w:kern w:val="0"/>
-                <w14:ligatures w14:val="none"/>
-              </w:rPr>
-              <w:t>Escolha</w:t>
-            </w:r>
-            <w:proofErr w:type="spellEnd"/>
-            <w:r>
-              <w:rPr>
-                <w:rFonts w:eastAsia="Times New Roman" w:cs="Noto Sans"/>
-                <w:kern w:val="0"/>
-                <w14:ligatures w14:val="none"/>
-              </w:rPr>
-              <w:t xml:space="preserve"> </w:t>
-            </w:r>
-            <w:proofErr w:type="spellStart"/>
-            <w:r>
-              <w:rPr>
-                <w:rFonts w:eastAsia="Times New Roman" w:cs="Noto Sans"/>
-                <w:kern w:val="0"/>
-                <w14:ligatures w14:val="none"/>
-              </w:rPr>
-              <w:t>única</w:t>
-            </w:r>
-            <w:proofErr w:type="spellEnd"/>
-          </w:p>
-        </w:tc>
-        <w:tc>
-          <w:tcPr>
-            <w:tcW w:w="0" w:type="auto"/>
-            <w:tcBorders>
-              <w:top w:val="single" w:sz="6" w:space="0" w:color="auto"/>
-              <w:left w:val="single" w:sz="6" w:space="0" w:color="auto"/>
-              <w:bottom w:val="single" w:sz="6" w:space="0" w:color="auto"/>
-              <w:right w:val="single" w:sz="6" w:space="0" w:color="auto"/>
-            </w:tcBorders>
-            <w:tcMar>
-              <w:top w:w="60" w:type="dxa"/>
-              <w:left w:w="120" w:type="dxa"/>
-              <w:bottom w:w="60" w:type="dxa"/>
-              <w:right w:w="120" w:type="dxa"/>
-            </w:tcMar>
-            <w:hideMark/>
-          </w:tcPr>
-          <w:p>
-            <w:pPr>
-              <w:spacing w:after="0" w:line="240" w:lineRule="auto"/>
-              <w:rPr>
-                <w:rFonts w:eastAsia="Times New Roman" w:cs="Noto Sans"/>
-                <w:kern w:val="0"/>
-                <w:lang w:val="pt-PT"/>
-                <w14:ligatures w14:val="none"/>
-              </w:rPr>
-            </w:pPr>
-            <w:r>
-              <w:rPr>
-                <w:rFonts w:eastAsia="Times New Roman" w:cs="Noto Sans"/>
-                <w:kern w:val="0"/>
-                <w:lang w:val="pt-PT"/>
-                <w14:ligatures w14:val="none"/>
-              </w:rPr>
-              <w:t>Os mesmos 8 fatores de P8</w:t>
-            </w:r>
-          </w:p>
-        </w:tc>
-      </w:tr>
     </w:tbl>
     <w:p>
       <w:pPr>
@@ -10667,121 +11016,9 @@
         <w:rPr>
           <w:rFonts w:eastAsia="Times New Roman" w:cs="Noto Sans"/>
           <w:kern w:val="0"/>
-          <w:lang w:val="pt-PT"/>
           <w14:ligatures w14:val="none"/>
         </w:rPr>
-        <w:t>A </w:t>
-      </w:r>
-      <w:r>
-        <w:rPr>
-          <w:rFonts w:eastAsia="Times New Roman" w:cs="Noto Sans"/>
-          <w:b/>
-          <w:bCs/>
-          <w:kern w:val="0"/>
-          <w:bdr w:val="none" w:sz="0" w:space="0" w:color="auto" w:frame="1"/>
-          <w:lang w:val="pt-PT"/>
-          <w14:ligatures w14:val="none"/>
-        </w:rPr>
-        <w:t>GrowNear</w:t>
-      </w:r>
-      <w:r>
-        <w:rPr>
-          <w:rFonts w:eastAsia="Times New Roman" w:cs="Noto Sans"/>
-          <w:kern w:val="0"/>
-          <w:lang w:val="pt-PT"/>
-          <w14:ligatures w14:val="none"/>
-        </w:rPr>
-        <w:t xml:space="preserve"> é uma app em projeto que liga pequenos produtores com excedentes da horta, do pomar ou do galinheiro a quem quer comprar produtos locais. O comprador vê num mapa o que está disponível perto de si, reserva na app e vai buscar a encomenda a casa do produtor ou a um ponto de recolha (por exemplo, um café ou uma mercearia). </w:t>
-      </w:r>
-      <w:proofErr w:type="spellStart"/>
-      <w:r>
-        <w:rPr>
-          <w:rFonts w:eastAsia="Times New Roman" w:cs="Noto Sans"/>
-          <w:kern w:val="0"/>
-          <w14:ligatures w14:val="none"/>
-        </w:rPr>
-        <w:t>Não</w:t>
-      </w:r>
-      <w:proofErr w:type="spellEnd"/>
-      <w:r>
-        <w:rPr>
-          <w:rFonts w:eastAsia="Times New Roman" w:cs="Noto Sans"/>
-          <w:kern w:val="0"/>
-          <w14:ligatures w14:val="none"/>
-        </w:rPr>
-        <w:t xml:space="preserve"> </w:t>
-      </w:r>
-      <w:proofErr w:type="spellStart"/>
-      <w:r>
-        <w:rPr>
-          <w:rFonts w:eastAsia="Times New Roman" w:cs="Noto Sans"/>
-          <w:kern w:val="0"/>
-          <w14:ligatures w14:val="none"/>
-        </w:rPr>
-        <w:t>há</w:t>
-      </w:r>
-      <w:proofErr w:type="spellEnd"/>
-      <w:r>
-        <w:rPr>
-          <w:rFonts w:eastAsia="Times New Roman" w:cs="Noto Sans"/>
-          <w:kern w:val="0"/>
-          <w14:ligatures w14:val="none"/>
-        </w:rPr>
-        <w:t xml:space="preserve"> </w:t>
-      </w:r>
-      <w:proofErr w:type="spellStart"/>
-      <w:r>
-        <w:rPr>
-          <w:rFonts w:eastAsia="Times New Roman" w:cs="Noto Sans"/>
-          <w:kern w:val="0"/>
-          <w14:ligatures w14:val="none"/>
-        </w:rPr>
-        <w:t>entrega</w:t>
-      </w:r>
-      <w:proofErr w:type="spellEnd"/>
-      <w:r>
-        <w:rPr>
-          <w:rFonts w:eastAsia="Times New Roman" w:cs="Noto Sans"/>
-          <w:kern w:val="0"/>
-          <w14:ligatures w14:val="none"/>
-        </w:rPr>
-        <w:t xml:space="preserve"> </w:t>
-      </w:r>
-      <w:proofErr w:type="spellStart"/>
-      <w:r>
-        <w:rPr>
-          <w:rFonts w:eastAsia="Times New Roman" w:cs="Noto Sans"/>
-          <w:kern w:val="0"/>
-          <w14:ligatures w14:val="none"/>
-        </w:rPr>
-        <w:t>ao</w:t>
-      </w:r>
-      <w:proofErr w:type="spellEnd"/>
-      <w:r>
-        <w:rPr>
-          <w:rFonts w:eastAsia="Times New Roman" w:cs="Noto Sans"/>
-          <w:kern w:val="0"/>
-          <w14:ligatures w14:val="none"/>
-        </w:rPr>
-        <w:t xml:space="preserve"> </w:t>
-      </w:r>
-      <w:proofErr w:type="spellStart"/>
-      <w:r>
-        <w:rPr>
-          <w:rFonts w:eastAsia="Times New Roman" w:cs="Noto Sans"/>
-          <w:kern w:val="0"/>
-          <w14:ligatures w14:val="none"/>
-        </w:rPr>
-        <w:t>domicílio</w:t>
-      </w:r>
-      <w:proofErr w:type="spellEnd"/>
-      <w:r>
-        <w:rPr>
-          <w:rFonts w:eastAsia="Times New Roman" w:cs="Noto Sans"/>
-          <w:kern w:val="0"/>
-          <w14:ligatures w14:val="none"/>
-        </w:rPr>
-        <w:t>.</w:t>
+        <w:t xml:space="preserve">Chegou a altura de lhe apresentarmos a GrowNear: a app que estamos a desenvolver para ligar pequenos produtores com excedentes da horta, do pomar ou do galinheiro a quem quer comprar produtos locais. O comprador vê num mapa o que está disponível perto de si, reserva na app e vai buscar a encomenda a casa do produtor ou a um ponto de recolha (por exemplo, um café ou uma mercearia). Não há entrega ao domicílio.</w:t>
       </w:r>
     </w:p>
     <w:p>
@@ -11019,7 +11256,7 @@
                 <w:kern w:val="0"/>
                 <w14:ligatures w14:val="none"/>
               </w:rPr>
-              <w:t>P10</w:t>
+              <w:t xml:space="preserve">P9</w:t>
             </w:r>
           </w:p>
         </w:tc>
@@ -11210,7 +11447,7 @@
                 <w:kern w:val="0"/>
                 <w14:ligatures w14:val="none"/>
               </w:rPr>
-              <w:t>P11</w:t>
+              <w:t xml:space="preserve">P10</w:t>
             </w:r>
           </w:p>
         </w:tc>
@@ -11380,7 +11617,7 @@
                 <w:kern w:val="0"/>
                 <w14:ligatures w14:val="none"/>
               </w:rPr>
-              <w:t>P12</w:t>
+              <w:t xml:space="preserve">P11</w:t>
             </w:r>
           </w:p>
         </w:tc>
@@ -11784,7 +12021,7 @@
                 <w:kern w:val="0"/>
                 <w14:ligatures w14:val="none"/>
               </w:rPr>
-              <w:t>P13</w:t>
+              <w:t xml:space="preserve">P12</w:t>
             </w:r>
           </w:p>
         </w:tc>
@@ -11975,7 +12212,7 @@
                 <w:kern w:val="0"/>
                 <w14:ligatures w14:val="none"/>
               </w:rPr>
-              <w:t>P14</w:t>
+              <w:t xml:space="preserve">P13</w:t>
             </w:r>
           </w:p>
         </w:tc>
@@ -12179,7 +12416,7 @@
                 <w:kern w:val="0"/>
                 <w14:ligatures w14:val="none"/>
               </w:rPr>
-              <w:t>P15</w:t>
+              <w:t xml:space="preserve">P14</w:t>
             </w:r>
           </w:p>
         </w:tc>
@@ -12357,7 +12594,7 @@
                 <w:kern w:val="0"/>
                 <w14:ligatures w14:val="none"/>
               </w:rPr>
-              <w:t>P16</w:t>
+              <w:t xml:space="preserve">P15</w:t>
             </w:r>
           </w:p>
         </w:tc>
@@ -12586,8 +12823,7 @@
                 <w:kern w:val="0"/>
                 <w14:ligatures w14:val="none"/>
               </w:rPr>
-              <w:lastRenderedPageBreak/>
-              <w:t>P17</w:t>
+              <w:t xml:space="preserve">P16</w:t>
             </w:r>
           </w:p>
         </w:tc>
@@ -13049,7 +13285,7 @@
                 <w:kern w:val="0"/>
                 <w14:ligatures w14:val="none"/>
               </w:rPr>
-              <w:t>P18</w:t>
+              <w:t xml:space="preserve">P17</w:t>
             </w:r>
           </w:p>
         </w:tc>
@@ -13278,7 +13514,7 @@
                 <w:kern w:val="0"/>
                 <w14:ligatures w14:val="none"/>
               </w:rPr>
-              <w:t>P19</w:t>
+              <w:t xml:space="preserve">P18</w:t>
             </w:r>
           </w:p>
         </w:tc>
@@ -13707,7 +13943,7 @@
                 <w:kern w:val="0"/>
                 <w14:ligatures w14:val="none"/>
               </w:rPr>
-              <w:t>P20</w:t>
+              <w:t xml:space="preserve">P19</w:t>
             </w:r>
           </w:p>
         </w:tc>
@@ -13916,7 +14152,7 @@
                 <w:kern w:val="0"/>
                 <w14:ligatures w14:val="none"/>
               </w:rPr>
-              <w:t>P21</w:t>
+              <w:t xml:space="preserve">P20</w:t>
             </w:r>
           </w:p>
         </w:tc>
@@ -14125,8 +14361,7 @@
                 <w:kern w:val="0"/>
                 <w14:ligatures w14:val="none"/>
               </w:rPr>
-              <w:lastRenderedPageBreak/>
-              <w:t>P22</w:t>
+              <w:t xml:space="preserve">P21</w:t>
             </w:r>
           </w:p>
         </w:tc>
@@ -14296,7 +14531,7 @@
                 <w:kern w:val="0"/>
                 <w14:ligatures w14:val="none"/>
               </w:rPr>
-              <w:t>P23</w:t>
+              <w:t xml:space="preserve">P22</w:t>
             </w:r>
           </w:p>
         </w:tc>
@@ -14763,7 +14998,7 @@
                 <w:kern w:val="0"/>
                 <w14:ligatures w14:val="none"/>
               </w:rPr>
-              <w:t>P24</w:t>
+              <w:t xml:space="preserve">P23</w:t>
             </w:r>
           </w:p>
         </w:tc>
@@ -14967,7 +15202,7 @@
                 <w:kern w:val="0"/>
                 <w14:ligatures w14:val="none"/>
               </w:rPr>
-              <w:t>P25</w:t>
+              <w:t xml:space="preserve">P24</w:t>
             </w:r>
           </w:p>
         </w:tc>
@@ -15171,7 +15406,7 @@
                 <w:kern w:val="0"/>
                 <w14:ligatures w14:val="none"/>
               </w:rPr>
-              <w:t>P26</w:t>
+              <w:t xml:space="preserve">P25</w:t>
             </w:r>
           </w:p>
         </w:tc>
@@ -15317,7 +15552,7 @@
                 <w:lang w:val="pt-PT"/>
                 <w14:ligatures w14:val="none"/>
               </w:rPr>
-              <w:t>Norte · Centro · Área Metropolitana de Lisboa · Alentejo · Algarve · Açores · Madeira · Resido fora de Portugal</w:t>
+              <w:t xml:space="preserve">Área Metropolitana do Porto · Norte (exceto Área Metropolitana do Porto) · Centro · Área Metropolitana de Lisboa · Alentejo · Algarve · Açores · Madeira · Resido fora de Portugal</w:t>
             </w:r>
           </w:p>
         </w:tc>
@@ -15355,7 +15590,7 @@
                 <w:kern w:val="0"/>
                 <w14:ligatures w14:val="none"/>
               </w:rPr>
-              <w:t>P27</w:t>
+              <w:t xml:space="preserve">P26</w:t>
             </w:r>
           </w:p>
         </w:tc>
@@ -15525,7 +15760,7 @@
                 <w:kern w:val="0"/>
                 <w14:ligatures w14:val="none"/>
               </w:rPr>
-              <w:t>P28</w:t>
+              <w:t xml:space="preserve">P27</w:t>
             </w:r>
           </w:p>
         </w:tc>
@@ -15721,7 +15956,7 @@
                 <w:kern w:val="0"/>
                 <w14:ligatures w14:val="none"/>
               </w:rPr>
-              <w:t>P29</w:t>
+              <w:t xml:space="preserve">P28</w:t>
             </w:r>
           </w:p>
         </w:tc>
@@ -15891,7 +16126,7 @@
                 <w:kern w:val="0"/>
                 <w14:ligatures w14:val="none"/>
               </w:rPr>
-              <w:t>P30</w:t>
+              <w:t xml:space="preserve">P29</w:t>
             </w:r>
           </w:p>
         </w:tc>
@@ -16359,7 +16594,7 @@
                 <w:kern w:val="0"/>
                 <w14:ligatures w14:val="none"/>
               </w:rPr>
-              <w:t>P24 a P30</w:t>
+              <w:t xml:space="preserve">P23 a P29</w:t>
             </w:r>
           </w:p>
         </w:tc>
@@ -16583,45 +16818,45 @@
                 <w:kern w:val="0"/>
                 <w14:ligatures w14:val="none"/>
               </w:rPr>
-              <w:t>P20 a P23</w:t>
-            </w:r>
-          </w:p>
-        </w:tc>
-        <w:tc>
-          <w:tcPr>
-            <w:tcW w:w="0" w:type="auto"/>
-            <w:tcBorders>
-              <w:top w:val="single" w:sz="6" w:space="0" w:color="auto"/>
-              <w:left w:val="single" w:sz="6" w:space="0" w:color="auto"/>
-              <w:bottom w:val="single" w:sz="6" w:space="0" w:color="auto"/>
-              <w:right w:val="single" w:sz="6" w:space="0" w:color="auto"/>
-            </w:tcBorders>
-            <w:tcMar>
-              <w:top w:w="60" w:type="dxa"/>
-              <w:left w:w="120" w:type="dxa"/>
-              <w:bottom w:w="60" w:type="dxa"/>
-              <w:right w:w="120" w:type="dxa"/>
-            </w:tcMar>
-            <w:hideMark/>
-          </w:tcPr>
-          <w:p>
-            <w:pPr>
-              <w:spacing w:after="0" w:line="240" w:lineRule="auto"/>
-              <w:rPr>
-                <w:rFonts w:eastAsia="Times New Roman" w:cs="Noto Sans"/>
-                <w:kern w:val="0"/>
-                <w:lang w:val="pt-PT"/>
-                <w14:ligatures w14:val="none"/>
-              </w:rPr>
-            </w:pPr>
-            <w:r>
-              <w:rPr>
-                <w:rFonts w:eastAsia="Times New Roman" w:cs="Noto Sans"/>
-                <w:kern w:val="0"/>
-                <w:lang w:val="pt-PT"/>
-                <w14:ligatures w14:val="none"/>
-              </w:rPr>
-              <w:t>Média de P20 e P21; % com 4 ou 5</w:t>
+              <w:t xml:space="preserve">P19 a P22</w:t>
+            </w:r>
+          </w:p>
+        </w:tc>
+        <w:tc>
+          <w:tcPr>
+            <w:tcW w:w="0" w:type="auto"/>
+            <w:tcBorders>
+              <w:top w:val="single" w:sz="6" w:space="0" w:color="auto"/>
+              <w:left w:val="single" w:sz="6" w:space="0" w:color="auto"/>
+              <w:bottom w:val="single" w:sz="6" w:space="0" w:color="auto"/>
+              <w:right w:val="single" w:sz="6" w:space="0" w:color="auto"/>
+            </w:tcBorders>
+            <w:tcMar>
+              <w:top w:w="60" w:type="dxa"/>
+              <w:left w:w="120" w:type="dxa"/>
+              <w:bottom w:w="60" w:type="dxa"/>
+              <w:right w:w="120" w:type="dxa"/>
+            </w:tcMar>
+            <w:hideMark/>
+          </w:tcPr>
+          <w:p>
+            <w:pPr>
+              <w:spacing w:after="0" w:line="240" w:lineRule="auto"/>
+              <w:rPr>
+                <w:rFonts w:eastAsia="Times New Roman" w:cs="Noto Sans"/>
+                <w:kern w:val="0"/>
+                <w:lang w:val="pt-PT"/>
+                <w14:ligatures w14:val="none"/>
+              </w:rPr>
+            </w:pPr>
+            <w:r>
+              <w:rPr>
+                <w:rFonts w:eastAsia="Times New Roman" w:cs="Noto Sans"/>
+                <w:kern w:val="0"/>
+                <w:lang w:val="pt-PT"/>
+                <w14:ligatures w14:val="none"/>
+              </w:rPr>
+              <w:t xml:space="preserve">Média de P19 e P20; % com 4 ou 5</w:t>
             </w:r>
           </w:p>
         </w:tc>
@@ -16705,7 +16940,7 @@
                 <w:kern w:val="0"/>
                 <w14:ligatures w14:val="none"/>
               </w:rPr>
-              <w:t>P10 a P12</w:t>
+              <w:t xml:space="preserve">P9 a P11</w:t>
             </w:r>
           </w:p>
         </w:tc>
@@ -16827,45 +17062,45 @@
                 <w:kern w:val="0"/>
                 <w14:ligatures w14:val="none"/>
               </w:rPr>
-              <w:t>P8 a P9</w:t>
-            </w:r>
-          </w:p>
-        </w:tc>
-        <w:tc>
-          <w:tcPr>
-            <w:tcW w:w="0" w:type="auto"/>
-            <w:tcBorders>
-              <w:top w:val="single" w:sz="6" w:space="0" w:color="auto"/>
-              <w:left w:val="single" w:sz="6" w:space="0" w:color="auto"/>
-              <w:bottom w:val="single" w:sz="6" w:space="0" w:color="auto"/>
-              <w:right w:val="single" w:sz="6" w:space="0" w:color="auto"/>
-            </w:tcBorders>
-            <w:tcMar>
-              <w:top w:w="60" w:type="dxa"/>
-              <w:left w:w="120" w:type="dxa"/>
-              <w:bottom w:w="60" w:type="dxa"/>
-              <w:right w:w="120" w:type="dxa"/>
-            </w:tcMar>
-            <w:hideMark/>
-          </w:tcPr>
-          <w:p>
-            <w:pPr>
-              <w:spacing w:after="0" w:line="240" w:lineRule="auto"/>
-              <w:rPr>
-                <w:rFonts w:eastAsia="Times New Roman" w:cs="Noto Sans"/>
-                <w:kern w:val="0"/>
-                <w:lang w:val="pt-PT"/>
-                <w14:ligatures w14:val="none"/>
-              </w:rPr>
-            </w:pPr>
-            <w:r>
-              <w:rPr>
-                <w:rFonts w:eastAsia="Times New Roman" w:cs="Noto Sans"/>
-                <w:kern w:val="0"/>
-                <w:lang w:val="pt-PT"/>
-                <w14:ligatures w14:val="none"/>
-              </w:rPr>
-              <w:t>Ranking das médias (P8) e fator mais escolhido (P9)</w:t>
+              <w:t xml:space="preserve">P8</w:t>
+            </w:r>
+          </w:p>
+        </w:tc>
+        <w:tc>
+          <w:tcPr>
+            <w:tcW w:w="0" w:type="auto"/>
+            <w:tcBorders>
+              <w:top w:val="single" w:sz="6" w:space="0" w:color="auto"/>
+              <w:left w:val="single" w:sz="6" w:space="0" w:color="auto"/>
+              <w:bottom w:val="single" w:sz="6" w:space="0" w:color="auto"/>
+              <w:right w:val="single" w:sz="6" w:space="0" w:color="auto"/>
+            </w:tcBorders>
+            <w:tcMar>
+              <w:top w:w="60" w:type="dxa"/>
+              <w:left w:w="120" w:type="dxa"/>
+              <w:bottom w:w="60" w:type="dxa"/>
+              <w:right w:w="120" w:type="dxa"/>
+            </w:tcMar>
+            <w:hideMark/>
+          </w:tcPr>
+          <w:p>
+            <w:pPr>
+              <w:spacing w:after="0" w:line="240" w:lineRule="auto"/>
+              <w:rPr>
+                <w:rFonts w:eastAsia="Times New Roman" w:cs="Noto Sans"/>
+                <w:kern w:val="0"/>
+                <w:lang w:val="pt-PT"/>
+                <w14:ligatures w14:val="none"/>
+              </w:rPr>
+            </w:pPr>
+            <w:r>
+              <w:rPr>
+                <w:rFonts w:eastAsia="Times New Roman" w:cs="Noto Sans"/>
+                <w:kern w:val="0"/>
+                <w:lang w:val="pt-PT"/>
+                <w14:ligatures w14:val="none"/>
+              </w:rPr>
+              <w:t xml:space="preserve">Ranking das médias (P8)</w:t>
             </w:r>
           </w:p>
         </w:tc>
@@ -16949,45 +17184,45 @@
                 <w:kern w:val="0"/>
                 <w14:ligatures w14:val="none"/>
               </w:rPr>
-              <w:t>P13 a P17</w:t>
-            </w:r>
-          </w:p>
-        </w:tc>
-        <w:tc>
-          <w:tcPr>
-            <w:tcW w:w="0" w:type="auto"/>
-            <w:tcBorders>
-              <w:top w:val="single" w:sz="6" w:space="0" w:color="auto"/>
-              <w:left w:val="single" w:sz="6" w:space="0" w:color="auto"/>
-              <w:bottom w:val="single" w:sz="6" w:space="0" w:color="auto"/>
-              <w:right w:val="single" w:sz="6" w:space="0" w:color="auto"/>
-            </w:tcBorders>
-            <w:tcMar>
-              <w:top w:w="60" w:type="dxa"/>
-              <w:left w:w="120" w:type="dxa"/>
-              <w:bottom w:w="60" w:type="dxa"/>
-              <w:right w:w="120" w:type="dxa"/>
-            </w:tcMar>
-            <w:hideMark/>
-          </w:tcPr>
-          <w:p>
-            <w:pPr>
-              <w:spacing w:after="0" w:line="240" w:lineRule="auto"/>
-              <w:rPr>
-                <w:rFonts w:eastAsia="Times New Roman" w:cs="Noto Sans"/>
-                <w:kern w:val="0"/>
-                <w:lang w:val="pt-PT"/>
-                <w14:ligatures w14:val="none"/>
-              </w:rPr>
-            </w:pPr>
-            <w:r>
-              <w:rPr>
-                <w:rFonts w:eastAsia="Times New Roman" w:cs="Noto Sans"/>
-                <w:kern w:val="0"/>
-                <w:lang w:val="pt-PT"/>
-                <w14:ligatures w14:val="none"/>
-              </w:rPr>
-              <w:t>% que aceita a taxa (P15); valor modal por encomenda (P13)</w:t>
+              <w:t xml:space="preserve">P12 a P16</w:t>
+            </w:r>
+          </w:p>
+        </w:tc>
+        <w:tc>
+          <w:tcPr>
+            <w:tcW w:w="0" w:type="auto"/>
+            <w:tcBorders>
+              <w:top w:val="single" w:sz="6" w:space="0" w:color="auto"/>
+              <w:left w:val="single" w:sz="6" w:space="0" w:color="auto"/>
+              <w:bottom w:val="single" w:sz="6" w:space="0" w:color="auto"/>
+              <w:right w:val="single" w:sz="6" w:space="0" w:color="auto"/>
+            </w:tcBorders>
+            <w:tcMar>
+              <w:top w:w="60" w:type="dxa"/>
+              <w:left w:w="120" w:type="dxa"/>
+              <w:bottom w:w="60" w:type="dxa"/>
+              <w:right w:w="120" w:type="dxa"/>
+            </w:tcMar>
+            <w:hideMark/>
+          </w:tcPr>
+          <w:p>
+            <w:pPr>
+              <w:spacing w:after="0" w:line="240" w:lineRule="auto"/>
+              <w:rPr>
+                <w:rFonts w:eastAsia="Times New Roman" w:cs="Noto Sans"/>
+                <w:kern w:val="0"/>
+                <w:lang w:val="pt-PT"/>
+                <w14:ligatures w14:val="none"/>
+              </w:rPr>
+            </w:pPr>
+            <w:r>
+              <w:rPr>
+                <w:rFonts w:eastAsia="Times New Roman" w:cs="Noto Sans"/>
+                <w:kern w:val="0"/>
+                <w:lang w:val="pt-PT"/>
+                <w14:ligatures w14:val="none"/>
+              </w:rPr>
+              <w:t xml:space="preserve">% que aceita a taxa (P14); valor modal por encomenda (P12)</w:t>
             </w:r>
           </w:p>
         </w:tc>
@@ -17073,7 +17308,7 @@
                 <w:lang w:val="pt-PT"/>
                 <w14:ligatures w14:val="none"/>
               </w:rPr>
-              <w:t>P20 a P22 cruzadas com P1 a P5 e P24 a P30</w:t>
+              <w:t xml:space="preserve">P19 a P21 cruzadas com P1 a P5 e P23 a P29</w:t>
             </w:r>
           </w:p>
         </w:tc>
@@ -17239,45 +17474,45 @@
                 <w:kern w:val="0"/>
                 <w14:ligatures w14:val="none"/>
               </w:rPr>
-              <w:t>P18 a P19</w:t>
-            </w:r>
-          </w:p>
-        </w:tc>
-        <w:tc>
-          <w:tcPr>
-            <w:tcW w:w="0" w:type="auto"/>
-            <w:tcBorders>
-              <w:top w:val="single" w:sz="6" w:space="0" w:color="auto"/>
-              <w:left w:val="single" w:sz="6" w:space="0" w:color="auto"/>
-              <w:bottom w:val="single" w:sz="6" w:space="0" w:color="auto"/>
-              <w:right w:val="single" w:sz="6" w:space="0" w:color="auto"/>
-            </w:tcBorders>
-            <w:tcMar>
-              <w:top w:w="60" w:type="dxa"/>
-              <w:left w:w="120" w:type="dxa"/>
-              <w:bottom w:w="60" w:type="dxa"/>
-              <w:right w:w="120" w:type="dxa"/>
-            </w:tcMar>
-            <w:hideMark/>
-          </w:tcPr>
-          <w:p>
-            <w:pPr>
-              <w:spacing w:after="0" w:line="240" w:lineRule="auto"/>
-              <w:rPr>
-                <w:rFonts w:eastAsia="Times New Roman" w:cs="Noto Sans"/>
-                <w:kern w:val="0"/>
-                <w:lang w:val="pt-PT"/>
-                <w14:ligatures w14:val="none"/>
-              </w:rPr>
-            </w:pPr>
-            <w:r>
-              <w:rPr>
-                <w:rFonts w:eastAsia="Times New Roman" w:cs="Noto Sans"/>
-                <w:kern w:val="0"/>
-                <w:lang w:val="pt-PT"/>
-                <w14:ligatures w14:val="none"/>
-              </w:rPr>
-              <w:t>Média de aceitação; % que abandonaria (P19)</w:t>
+              <w:t xml:space="preserve">P17 a P18</w:t>
+            </w:r>
+          </w:p>
+        </w:tc>
+        <w:tc>
+          <w:tcPr>
+            <w:tcW w:w="0" w:type="auto"/>
+            <w:tcBorders>
+              <w:top w:val="single" w:sz="6" w:space="0" w:color="auto"/>
+              <w:left w:val="single" w:sz="6" w:space="0" w:color="auto"/>
+              <w:bottom w:val="single" w:sz="6" w:space="0" w:color="auto"/>
+              <w:right w:val="single" w:sz="6" w:space="0" w:color="auto"/>
+            </w:tcBorders>
+            <w:tcMar>
+              <w:top w:w="60" w:type="dxa"/>
+              <w:left w:w="120" w:type="dxa"/>
+              <w:bottom w:w="60" w:type="dxa"/>
+              <w:right w:w="120" w:type="dxa"/>
+            </w:tcMar>
+            <w:hideMark/>
+          </w:tcPr>
+          <w:p>
+            <w:pPr>
+              <w:spacing w:after="0" w:line="240" w:lineRule="auto"/>
+              <w:rPr>
+                <w:rFonts w:eastAsia="Times New Roman" w:cs="Noto Sans"/>
+                <w:kern w:val="0"/>
+                <w:lang w:val="pt-PT"/>
+                <w14:ligatures w14:val="none"/>
+              </w:rPr>
+            </w:pPr>
+            <w:r>
+              <w:rPr>
+                <w:rFonts w:eastAsia="Times New Roman" w:cs="Noto Sans"/>
+                <w:kern w:val="0"/>
+                <w:lang w:val="pt-PT"/>
+                <w14:ligatures w14:val="none"/>
+              </w:rPr>
+              <w:t xml:space="preserve">Média de aceitação; % que abandonaria (P18)</w:t>
             </w:r>
           </w:p>
         </w:tc>
@@ -17327,7 +17562,7 @@
           <w:lang w:val="pt-PT"/>
           <w14:ligatures w14:val="none"/>
         </w:rPr>
-        <w:t>5. Decisões e riscos a discutir em grupo</w:t>
+        <w:t xml:space="preserve">5. Limitações e riscos</w:t>
       </w:r>
     </w:p>
     <w:tbl>
@@ -17667,93 +17902,10 @@
               <w:rPr>
                 <w:rFonts w:eastAsia="Times New Roman" w:cs="Noto Sans"/>
                 <w:kern w:val="0"/>
-                <w:lang w:val="pt-PT"/>
-                <w14:ligatures w14:val="none"/>
-              </w:rPr>
-              <w:t xml:space="preserve">As opções "Menos de 18" (P24), "Resido fora de Portugal" (P26), "Nunca" (P2) e "Não costumo fazer as compras" (P30) permitem identificá-los. O Excel bruto entrega-se com todos; no R2 decide-se se entram na análise. </w:t>
-            </w:r>
-            <w:proofErr w:type="spellStart"/>
-            <w:r>
-              <w:rPr>
-                <w:rFonts w:eastAsia="Times New Roman" w:cs="Noto Sans"/>
-                <w:kern w:val="0"/>
-                <w14:ligatures w14:val="none"/>
-              </w:rPr>
-              <w:t>Convém</w:t>
-            </w:r>
-            <w:proofErr w:type="spellEnd"/>
-            <w:r>
-              <w:rPr>
-                <w:rFonts w:eastAsia="Times New Roman" w:cs="Noto Sans"/>
-                <w:kern w:val="0"/>
-                <w14:ligatures w14:val="none"/>
-              </w:rPr>
-              <w:t xml:space="preserve"> </w:t>
-            </w:r>
-            <w:proofErr w:type="spellStart"/>
-            <w:r>
-              <w:rPr>
-                <w:rFonts w:eastAsia="Times New Roman" w:cs="Noto Sans"/>
-                <w:kern w:val="0"/>
-                <w14:ligatures w14:val="none"/>
-              </w:rPr>
-              <w:t>recolher</w:t>
-            </w:r>
-            <w:proofErr w:type="spellEnd"/>
-            <w:r>
-              <w:rPr>
-                <w:rFonts w:eastAsia="Times New Roman" w:cs="Noto Sans"/>
-                <w:kern w:val="0"/>
-                <w14:ligatures w14:val="none"/>
-              </w:rPr>
-              <w:t xml:space="preserve"> 110 a 120 </w:t>
-            </w:r>
-            <w:proofErr w:type="spellStart"/>
-            <w:r>
-              <w:rPr>
-                <w:rFonts w:eastAsia="Times New Roman" w:cs="Noto Sans"/>
-                <w:kern w:val="0"/>
-                <w14:ligatures w14:val="none"/>
-              </w:rPr>
-              <w:t>respostas</w:t>
-            </w:r>
-            <w:proofErr w:type="spellEnd"/>
-            <w:r>
-              <w:rPr>
-                <w:rFonts w:eastAsia="Times New Roman" w:cs="Noto Sans"/>
-                <w:kern w:val="0"/>
-                <w14:ligatures w14:val="none"/>
-              </w:rPr>
-              <w:t xml:space="preserve"> para </w:t>
-            </w:r>
-            <w:proofErr w:type="spellStart"/>
-            <w:r>
-              <w:rPr>
-                <w:rFonts w:eastAsia="Times New Roman" w:cs="Noto Sans"/>
-                <w:kern w:val="0"/>
-                <w14:ligatures w14:val="none"/>
-              </w:rPr>
-              <w:t>garantir</w:t>
-            </w:r>
-            <w:proofErr w:type="spellEnd"/>
-            <w:r>
-              <w:rPr>
-                <w:rFonts w:eastAsia="Times New Roman" w:cs="Noto Sans"/>
-                <w:kern w:val="0"/>
-                <w14:ligatures w14:val="none"/>
-              </w:rPr>
-              <w:t xml:space="preserve"> 100 </w:t>
-            </w:r>
-            <w:proofErr w:type="spellStart"/>
-            <w:r>
-              <w:rPr>
-                <w:rFonts w:eastAsia="Times New Roman" w:cs="Noto Sans"/>
-                <w:kern w:val="0"/>
-                <w14:ligatures w14:val="none"/>
-              </w:rPr>
-              <w:t>válidas</w:t>
-            </w:r>
-            <w:proofErr w:type="spellEnd"/>
+                <w14:ligatures w14:val="none"/>
+              </w:rPr>
+              <w:t xml:space="preserve">As opções "Menos de 18" (P23), "Resido fora de Portugal" (P25), "Nunca" (P2) e "Não costumo fazer as compras" (P29) permitem identificá-los. O Excel bruto entrega-se com todos; no R2 decide-se se entram na análise. Convém recolher 110 a 120 respostas para garantir 100 válidas</w:t>
+            </w:r>
           </w:p>
         </w:tc>
       </w:tr>
@@ -17828,7 +17980,7 @@
                 <w:lang w:val="pt-PT"/>
                 <w14:ligatures w14:val="none"/>
               </w:rPr>
-              <w:t>P15 testa um só preço</w:t>
+              <w:t xml:space="preserve">P14 testa um só preço</w:t>
             </w:r>
           </w:p>
         </w:tc>
@@ -17904,25 +18056,7 @@
                 <w:lang w:val="pt-PT"/>
                 <w14:ligatures w14:val="none"/>
               </w:rPr>
-              <w:t>Suficiente para o R1. A taxa corresponde à proposta de 0,50 € + 5 %, ainda por decidir. Se a taxa</w:t>
-            </w:r>
-            <w:r>
-              <w:rPr>
-                <w:rFonts w:eastAsia="Times New Roman" w:cs="Noto Sans"/>
-                <w:kern w:val="0"/>
-                <w:lang w:val="pt-PT"/>
-                <w14:ligatures w14:val="none"/>
-              </w:rPr>
-              <w:t xml:space="preserve"> mudar</w:t>
-            </w:r>
-            <w:r>
-              <w:rPr>
-                <w:rFonts w:eastAsia="Times New Roman" w:cs="Noto Sans"/>
-                <w:kern w:val="0"/>
-                <w:lang w:val="pt-PT"/>
-                <w14:ligatures w14:val="none"/>
-              </w:rPr>
-              <w:t>, muda o valor na pergunta</w:t>
+              <w:t xml:space="preserve">Suficiente para o R1. A taxa corresponde à proposta de 0,50 € + 5 %, decidida pelo grupo. Se a taxa mudar, muda o valor na pergunta</w:t>
             </w:r>
           </w:p>
         </w:tc>
@@ -17996,36 +18130,8 @@
                 <w:kern w:val="0"/>
                 <w14:ligatures w14:val="none"/>
               </w:rPr>
-              <w:t xml:space="preserve">P16, </w:t>
-            </w:r>
-            <w:proofErr w:type="spellStart"/>
-            <w:r>
-              <w:rPr>
-                <w:rFonts w:eastAsia="Times New Roman" w:cs="Noto Sans"/>
-                <w:kern w:val="0"/>
-                <w14:ligatures w14:val="none"/>
-              </w:rPr>
-              <w:t>terceira</w:t>
-            </w:r>
-            <w:proofErr w:type="spellEnd"/>
-            <w:r>
-              <w:rPr>
-                <w:rFonts w:eastAsia="Times New Roman" w:cs="Noto Sans"/>
-                <w:kern w:val="0"/>
-                <w14:ligatures w14:val="none"/>
-              </w:rPr>
-              <w:t xml:space="preserve"> </w:t>
-            </w:r>
-            <w:proofErr w:type="spellStart"/>
-            <w:r>
-              <w:rPr>
-                <w:rFonts w:eastAsia="Times New Roman" w:cs="Noto Sans"/>
-                <w:kern w:val="0"/>
-                <w14:ligatures w14:val="none"/>
-              </w:rPr>
-              <w:t>afirmação</w:t>
-            </w:r>
-            <w:proofErr w:type="spellEnd"/>
+              <w:t xml:space="preserve">P15, terceira afirmação</w:t>
+            </w:r>
           </w:p>
         </w:tc>
         <w:tc>
@@ -18251,7 +18357,7 @@
                 <w:lang w:val="pt-PT"/>
                 <w14:ligatures w14:val="none"/>
               </w:rPr>
-              <w:t>P20 a P22 sobrestimam o uso real</w:t>
+              <w:t xml:space="preserve">P19 a P21 sobrestimam o uso real</w:t>
             </w:r>
           </w:p>
         </w:tc>
@@ -18357,6 +18463,42 @@
                 <w14:ligatures w14:val="none"/>
               </w:rPr>
             </w:pPr>
+            <w:r>
+              <w:rPr>
+                <w:rFonts w:eastAsia="Times New Roman" w:cs="Noto Sans"/>
+                <w:kern w:val="0"/>
+                <w14:ligatures w14:val="none"/>
+              </w:rPr>
+              <w:t xml:space="preserve">Duração de 29 perguntas</w:t>
+            </w:r>
+          </w:p>
+        </w:tc>
+        <w:tc>
+          <w:tcPr>
+            <w:tcW w:w="0" w:type="auto"/>
+            <w:tcBorders>
+              <w:top w:val="single" w:sz="6" w:space="0" w:color="auto"/>
+              <w:left w:val="single" w:sz="6" w:space="0" w:color="auto"/>
+              <w:bottom w:val="single" w:sz="6" w:space="0" w:color="auto"/>
+              <w:right w:val="single" w:sz="6" w:space="0" w:color="auto"/>
+            </w:tcBorders>
+            <w:tcMar>
+              <w:top w:w="60" w:type="dxa"/>
+              <w:left w:w="120" w:type="dxa"/>
+              <w:bottom w:w="60" w:type="dxa"/>
+              <w:right w:w="120" w:type="dxa"/>
+            </w:tcMar>
+            <w:hideMark/>
+          </w:tcPr>
+          <w:p>
+            <w:pPr>
+              <w:spacing w:after="0" w:line="240" w:lineRule="auto"/>
+              <w:rPr>
+                <w:rFonts w:eastAsia="Times New Roman" w:cs="Noto Sans"/>
+                <w:kern w:val="0"/>
+                <w14:ligatures w14:val="none"/>
+              </w:rPr>
+            </w:pPr>
             <w:proofErr w:type="spellStart"/>
             <w:r>
               <w:rPr>
@@ -18364,7 +18506,7 @@
                 <w:kern w:val="0"/>
                 <w14:ligatures w14:val="none"/>
               </w:rPr>
-              <w:t>Duração</w:t>
+              <w:t>Abandono</w:t>
             </w:r>
             <w:proofErr w:type="spellEnd"/>
             <w:r>
@@ -18373,7 +18515,7 @@
                 <w:kern w:val="0"/>
                 <w14:ligatures w14:val="none"/>
               </w:rPr>
-              <w:t xml:space="preserve"> de 30 </w:t>
+              <w:t xml:space="preserve"> a </w:t>
             </w:r>
             <w:proofErr w:type="spellStart"/>
             <w:r>
@@ -18382,7 +18524,7 @@
                 <w:kern w:val="0"/>
                 <w14:ligatures w14:val="none"/>
               </w:rPr>
-              <w:t>perguntas</w:t>
+              <w:t>meio</w:t>
             </w:r>
             <w:proofErr w:type="spellEnd"/>
           </w:p>
@@ -18410,110 +18552,18 @@
               <w:rPr>
                 <w:rFonts w:eastAsia="Times New Roman" w:cs="Noto Sans"/>
                 <w:kern w:val="0"/>
-                <w14:ligatures w14:val="none"/>
-              </w:rPr>
-            </w:pPr>
-            <w:proofErr w:type="spellStart"/>
-            <w:r>
-              <w:rPr>
-                <w:rFonts w:eastAsia="Times New Roman" w:cs="Noto Sans"/>
-                <w:kern w:val="0"/>
-                <w14:ligatures w14:val="none"/>
-              </w:rPr>
-              <w:t>Abandono</w:t>
-            </w:r>
-            <w:proofErr w:type="spellEnd"/>
-            <w:r>
-              <w:rPr>
-                <w:rFonts w:eastAsia="Times New Roman" w:cs="Noto Sans"/>
-                <w:kern w:val="0"/>
-                <w14:ligatures w14:val="none"/>
-              </w:rPr>
-              <w:t xml:space="preserve"> a </w:t>
-            </w:r>
-            <w:proofErr w:type="spellStart"/>
-            <w:r>
-              <w:rPr>
-                <w:rFonts w:eastAsia="Times New Roman" w:cs="Noto Sans"/>
-                <w:kern w:val="0"/>
-                <w14:ligatures w14:val="none"/>
-              </w:rPr>
-              <w:t>meio</w:t>
-            </w:r>
-            <w:proofErr w:type="spellEnd"/>
-          </w:p>
-        </w:tc>
-        <w:tc>
-          <w:tcPr>
-            <w:tcW w:w="0" w:type="auto"/>
-            <w:tcBorders>
-              <w:top w:val="single" w:sz="6" w:space="0" w:color="auto"/>
-              <w:left w:val="single" w:sz="6" w:space="0" w:color="auto"/>
-              <w:bottom w:val="single" w:sz="6" w:space="0" w:color="auto"/>
-              <w:right w:val="single" w:sz="6" w:space="0" w:color="auto"/>
-            </w:tcBorders>
-            <w:tcMar>
-              <w:top w:w="60" w:type="dxa"/>
-              <w:left w:w="120" w:type="dxa"/>
-              <w:bottom w:w="60" w:type="dxa"/>
-              <w:right w:w="120" w:type="dxa"/>
-            </w:tcMar>
-            <w:hideMark/>
-          </w:tcPr>
-          <w:p>
-            <w:pPr>
-              <w:spacing w:after="0" w:line="240" w:lineRule="auto"/>
-              <w:rPr>
-                <w:rFonts w:eastAsia="Times New Roman" w:cs="Noto Sans"/>
-                <w:kern w:val="0"/>
-                <w:lang w:val="pt-PT"/>
-                <w14:ligatures w14:val="none"/>
-              </w:rPr>
-            </w:pPr>
-            <w:r>
-              <w:rPr>
-                <w:rFonts w:eastAsia="Times New Roman" w:cs="Noto Sans"/>
-                <w:kern w:val="0"/>
-                <w:lang w:val="pt-PT"/>
-                <w14:ligatures w14:val="none"/>
-              </w:rPr>
-              <w:t xml:space="preserve">Se for preciso </w:t>
-            </w:r>
-            <w:r>
-              <w:rPr>
-                <w:rFonts w:eastAsia="Times New Roman" w:cs="Noto Sans"/>
-                <w:kern w:val="0"/>
-                <w:lang w:val="pt-PT"/>
-                <w14:ligatures w14:val="none"/>
-              </w:rPr>
-              <w:t>remover perguntas, segue-se a</w:t>
-            </w:r>
-            <w:r>
-              <w:rPr>
-                <w:rFonts w:eastAsia="Times New Roman" w:cs="Noto Sans"/>
-                <w:kern w:val="0"/>
-                <w:lang w:val="pt-PT"/>
-                <w14:ligatures w14:val="none"/>
-              </w:rPr>
-              <w:t xml:space="preserve"> ordem</w:t>
-            </w:r>
-            <w:r>
-              <w:rPr>
-                <w:rFonts w:eastAsia="Times New Roman" w:cs="Noto Sans"/>
-                <w:kern w:val="0"/>
-                <w:lang w:val="pt-PT"/>
-                <w14:ligatures w14:val="none"/>
-              </w:rPr>
-              <w:t xml:space="preserve"> de importância</w:t>
-            </w:r>
-            <w:r>
-              <w:rPr>
-                <w:rFonts w:eastAsia="Times New Roman" w:cs="Noto Sans"/>
-                <w:kern w:val="0"/>
-                <w:lang w:val="pt-PT"/>
-                <w14:ligatures w14:val="none"/>
-              </w:rPr>
-              <w:t>: P25, P12, P7, P17</w:t>
+                <w:lang w:val="pt-PT"/>
+                <w14:ligatures w14:val="none"/>
+              </w:rPr>
+            </w:pPr>
+            <w:r>
+              <w:rPr>
+                <w:rFonts w:eastAsia="Times New Roman" w:cs="Noto Sans"/>
+                <w:kern w:val="0"/>
+                <w:lang w:val="pt-PT"/>
+                <w14:ligatures w14:val="none"/>
+              </w:rPr>
+              <w:t xml:space="preserve">Se for preciso remover perguntas, segue-se a ordem de importância: P24, P11, P7, P16</w:t>
             </w:r>
           </w:p>
         </w:tc>
@@ -18645,7 +18695,7 @@
                 <w:lang w:val="pt-PT"/>
                 <w14:ligatures w14:val="none"/>
               </w:rPr>
-              <w:t>Com 100 respostas, 7 faixas etárias ou 8 regiões não dão 30 por grupo</w:t>
+              <w:t xml:space="preserve">Com 100 respostas, 7 faixas etárias ou 9 regiões não dão 30 por grupo</w:t>
             </w:r>
           </w:p>
         </w:tc>
@@ -18843,7 +18893,7 @@
                 <w:lang w:val="pt-PT"/>
                 <w14:ligatures w14:val="none"/>
               </w:rPr>
-              <w:t>Omitida de propósito: é sensível e aumenta o abandono. P3 e P29 servem de aproximação</w:t>
+              <w:t xml:space="preserve">Omitida de propósito: é sensível e aumenta o abandono. P3 e P28 servem de aproximação</w:t>
             </w:r>
           </w:p>
         </w:tc>
@@ -19417,7 +19467,7 @@
                 <w:lang w:val="pt-PT"/>
                 <w14:ligatures w14:val="none"/>
               </w:rPr>
-              <w:t>P20 e P21: "Escala linear" de 1 a 5 com legendas nos extremos. P7, P8, P16 e P18: "Grelha de escolha múltipla" com colunas 1, 2, 3, 4, 5 (só o número, para o Excel ficar numérico) e a legenda no enunciado</w:t>
+              <w:t xml:space="preserve">P19 e P20: "Escala linear" de 1 a 5 com legendas nos extremos. P7, P8, P15 e P17: "Grelha de escolha múltipla" com colunas 1, 2, 3, 4, 5 (só o número, para o Excel ficar numérico) e a legenda no enunciado</w:t>
             </w:r>
           </w:p>
         </w:tc>
@@ -19685,7 +19735,7 @@
                 <w:lang w:val="pt-PT"/>
                 <w14:ligatures w14:val="none"/>
               </w:rPr>
-              <w:t>Ativar "Ordenar linhas aleatoriamente" em P8 e P16, para reduzir o efeito de ordem</w:t>
+              <w:t xml:space="preserve">Ativar "Ordenar linhas aleatoriamente" em P8 e P15, para reduzir o efeito de ordem</w:t>
             </w:r>
           </w:p>
         </w:tc>

</xml_diff>

<commit_message>
Grow near Word report fixes
</commit_message>
<xml_diff>
--- a/Files/GrowNear_Relatorio.docx
+++ b/Files/GrowNear_Relatorio.docx
@@ -1743,7 +1743,7 @@
           <w:noProof/>
         </w:rPr>
         <w:drawing>
-          <wp:inline distT="0" distB="0" distL="0" distR="0" wp14:anchorId="77CF8721" wp14:editId="69B2DF3B">
+          <wp:inline distT="0" distB="0" distL="0" distR="0" wp14:anchorId="77CF8721" wp14:editId="565D2910">
             <wp:extent cx="5000878" cy="3722337"/>
             <wp:effectExtent l="0" t="0" r="3175" b="0"/>
             <wp:docPr id="1395881417" name="Picture 4"/>
@@ -1875,7 +1875,6 @@
     <w:p>
       <w:pPr>
         <w:spacing w:before="120" w:after="120" w:line="330" w:lineRule="atLeast"/>
-        <w:jc w:val="center"/>
         <w:textAlignment w:val="baseline"/>
         <w:outlineLvl w:val="0"/>
         <w:rPr>
@@ -5605,11 +5604,10 @@
         <w:tblLook w:val="04A0" w:firstRow="1" w:lastRow="0" w:firstColumn="1" w:lastColumn="0" w:noHBand="0" w:noVBand="1"/>
       </w:tblPr>
       <w:tblGrid>
-        <w:gridCol w:w="2508"/>
-        <w:gridCol w:w="1162"/>
-        <w:gridCol w:w="2066"/>
+        <w:gridCol w:w="2774"/>
+        <w:gridCol w:w="2291"/>
         <w:gridCol w:w="597"/>
-        <w:gridCol w:w="3011"/>
+        <w:gridCol w:w="3527"/>
       </w:tblGrid>
       <w:tr>
         <w:trPr>
@@ -5706,7 +5704,7 @@
                 <w:kern w:val="0"/>
                 <w14:ligatures w14:val="none"/>
               </w:rPr>
-              <w:t>Objetivo</w:t>
+              <w:t>Perguntas</w:t>
             </w:r>
             <w:proofErr w:type="spellEnd"/>
           </w:p>
@@ -5740,7 +5738,7 @@
                 <w14:ligatures w14:val="none"/>
               </w:rPr>
             </w:pPr>
-            <w:proofErr w:type="spellStart"/>
+            <w:proofErr w:type="gramStart"/>
             <w:r>
               <w:rPr>
                 <w:rFonts w:eastAsia="Times New Roman" w:cs="Noto Sans"/>
@@ -5749,9 +5747,9 @@
                 <w:kern w:val="0"/>
                 <w14:ligatures w14:val="none"/>
               </w:rPr>
-              <w:t>Perguntas</w:t>
-            </w:r>
-            <w:proofErr w:type="spellEnd"/>
+              <w:t>N.º</w:t>
+            </w:r>
+            <w:proofErr w:type="gramEnd"/>
           </w:p>
         </w:tc>
         <w:tc>
@@ -5783,7 +5781,6 @@
                 <w14:ligatures w14:val="none"/>
               </w:rPr>
             </w:pPr>
-            <w:proofErr w:type="gramStart"/>
             <w:r>
               <w:rPr>
                 <w:rFonts w:eastAsia="Times New Roman" w:cs="Noto Sans"/>
@@ -5792,32 +5789,10 @@
                 <w:kern w:val="0"/>
                 <w14:ligatures w14:val="none"/>
               </w:rPr>
-              <w:t>N.º</w:t>
-            </w:r>
-            <w:proofErr w:type="gramEnd"/>
-          </w:p>
-        </w:tc>
-        <w:tc>
-          <w:tcPr>
-            <w:tcW w:w="0" w:type="auto"/>
-            <w:tcBorders>
-              <w:top w:val="single" w:sz="6" w:space="0" w:color="auto"/>
-              <w:left w:val="single" w:sz="6" w:space="0" w:color="auto"/>
-              <w:bottom w:val="single" w:sz="6" w:space="0" w:color="auto"/>
-              <w:right w:val="single" w:sz="6" w:space="0" w:color="auto"/>
-            </w:tcBorders>
-            <w:tcMar>
-              <w:top w:w="60" w:type="dxa"/>
-              <w:left w:w="120" w:type="dxa"/>
-              <w:bottom w:w="60" w:type="dxa"/>
-              <w:right w:w="120" w:type="dxa"/>
-            </w:tcMar>
-            <w:hideMark/>
-          </w:tcPr>
-          <w:p>
-            <w:pPr>
-              <w:spacing w:after="0" w:line="240" w:lineRule="auto"/>
-              <w:jc w:val="center"/>
+              <w:t xml:space="preserve">Tipo </w:t>
+            </w:r>
+            <w:proofErr w:type="spellStart"/>
+            <w:r>
               <w:rPr>
                 <w:rFonts w:eastAsia="Times New Roman" w:cs="Noto Sans"/>
                 <w:b/>
@@ -5825,26 +5800,6 @@
                 <w:kern w:val="0"/>
                 <w14:ligatures w14:val="none"/>
               </w:rPr>
-            </w:pPr>
-            <w:r>
-              <w:rPr>
-                <w:rFonts w:eastAsia="Times New Roman" w:cs="Noto Sans"/>
-                <w:b/>
-                <w:bCs/>
-                <w:kern w:val="0"/>
-                <w14:ligatures w14:val="none"/>
-              </w:rPr>
-              <w:t xml:space="preserve">Tipo </w:t>
-            </w:r>
-            <w:proofErr w:type="spellStart"/>
-            <w:r>
-              <w:rPr>
-                <w:rFonts w:eastAsia="Times New Roman" w:cs="Noto Sans"/>
-                <w:b/>
-                <w:bCs/>
-                <w:kern w:val="0"/>
-                <w14:ligatures w14:val="none"/>
-              </w:rPr>
               <w:t>dominante</w:t>
             </w:r>
             <w:proofErr w:type="spellEnd"/>
@@ -5884,7 +5839,7 @@
                 <w:kern w:val="0"/>
                 <w14:ligatures w14:val="none"/>
               </w:rPr>
-              <w:t xml:space="preserve">0. </w:t>
+              <w:t>0. A</w:t>
             </w:r>
             <w:proofErr w:type="spellStart"/>
             <w:r>
@@ -5893,45 +5848,9 @@
                 <w:kern w:val="0"/>
                 <w14:ligatures w14:val="none"/>
               </w:rPr>
-              <w:t>Apresentação</w:t>
+              <w:t>presentação</w:t>
             </w:r>
             <w:proofErr w:type="spellEnd"/>
-          </w:p>
-        </w:tc>
-        <w:tc>
-          <w:tcPr>
-            <w:tcW w:w="0" w:type="auto"/>
-            <w:tcBorders>
-              <w:top w:val="single" w:sz="6" w:space="0" w:color="auto"/>
-              <w:left w:val="single" w:sz="6" w:space="0" w:color="auto"/>
-              <w:bottom w:val="single" w:sz="6" w:space="0" w:color="auto"/>
-              <w:right w:val="single" w:sz="6" w:space="0" w:color="auto"/>
-            </w:tcBorders>
-            <w:tcMar>
-              <w:top w:w="60" w:type="dxa"/>
-              <w:left w:w="120" w:type="dxa"/>
-              <w:bottom w:w="60" w:type="dxa"/>
-              <w:right w:w="120" w:type="dxa"/>
-            </w:tcMar>
-            <w:hideMark/>
-          </w:tcPr>
-          <w:p>
-            <w:pPr>
-              <w:spacing w:after="0" w:line="240" w:lineRule="auto"/>
-              <w:rPr>
-                <w:rFonts w:eastAsia="Times New Roman" w:cs="Noto Sans"/>
-                <w:kern w:val="0"/>
-                <w14:ligatures w14:val="none"/>
-              </w:rPr>
-            </w:pPr>
-            <w:r>
-              <w:rPr>
-                <w:rFonts w:eastAsia="Times New Roman" w:cs="Noto Sans"/>
-                <w:kern w:val="0"/>
-                <w14:ligatures w14:val="none"/>
-              </w:rPr>
-              <w:t>—</w:t>
-            </w:r>
           </w:p>
         </w:tc>
         <w:tc>
@@ -6096,7 +6015,7 @@
                 <w:kern w:val="0"/>
                 <w14:ligatures w14:val="none"/>
               </w:rPr>
-              <w:t xml:space="preserve">1. </w:t>
+              <w:t>1. H</w:t>
             </w:r>
             <w:proofErr w:type="spellStart"/>
             <w:r>
@@ -6105,7 +6024,7 @@
                 <w:kern w:val="0"/>
                 <w14:ligatures w14:val="none"/>
               </w:rPr>
-              <w:t>Hábitos</w:t>
+              <w:t>ábitos</w:t>
             </w:r>
             <w:proofErr w:type="spellEnd"/>
             <w:r>
@@ -6126,42 +6045,6 @@
               <w:t>compra</w:t>
             </w:r>
             <w:proofErr w:type="spellEnd"/>
-          </w:p>
-        </w:tc>
-        <w:tc>
-          <w:tcPr>
-            <w:tcW w:w="0" w:type="auto"/>
-            <w:tcBorders>
-              <w:top w:val="single" w:sz="6" w:space="0" w:color="auto"/>
-              <w:left w:val="single" w:sz="6" w:space="0" w:color="auto"/>
-              <w:bottom w:val="single" w:sz="6" w:space="0" w:color="auto"/>
-              <w:right w:val="single" w:sz="6" w:space="0" w:color="auto"/>
-            </w:tcBorders>
-            <w:tcMar>
-              <w:top w:w="60" w:type="dxa"/>
-              <w:left w:w="120" w:type="dxa"/>
-              <w:bottom w:w="60" w:type="dxa"/>
-              <w:right w:w="120" w:type="dxa"/>
-            </w:tcMar>
-            <w:hideMark/>
-          </w:tcPr>
-          <w:p>
-            <w:pPr>
-              <w:spacing w:after="0" w:line="240" w:lineRule="auto"/>
-              <w:rPr>
-                <w:rFonts w:eastAsia="Times New Roman" w:cs="Noto Sans"/>
-                <w:kern w:val="0"/>
-                <w14:ligatures w14:val="none"/>
-              </w:rPr>
-            </w:pPr>
-            <w:r>
-              <w:rPr>
-                <w:rFonts w:eastAsia="Times New Roman" w:cs="Noto Sans"/>
-                <w:kern w:val="0"/>
-                <w14:ligatures w14:val="none"/>
-              </w:rPr>
-              <w:t>OE2</w:t>
-            </w:r>
           </w:p>
         </w:tc>
         <w:tc>
@@ -6372,42 +6255,6 @@
                 <w:kern w:val="0"/>
                 <w14:ligatures w14:val="none"/>
               </w:rPr>
-              <w:t>OE5</w:t>
-            </w:r>
-          </w:p>
-        </w:tc>
-        <w:tc>
-          <w:tcPr>
-            <w:tcW w:w="0" w:type="auto"/>
-            <w:tcBorders>
-              <w:top w:val="single" w:sz="6" w:space="0" w:color="auto"/>
-              <w:left w:val="single" w:sz="6" w:space="0" w:color="auto"/>
-              <w:bottom w:val="single" w:sz="6" w:space="0" w:color="auto"/>
-              <w:right w:val="single" w:sz="6" w:space="0" w:color="auto"/>
-            </w:tcBorders>
-            <w:tcMar>
-              <w:top w:w="60" w:type="dxa"/>
-              <w:left w:w="120" w:type="dxa"/>
-              <w:bottom w:w="60" w:type="dxa"/>
-              <w:right w:w="120" w:type="dxa"/>
-            </w:tcMar>
-            <w:hideMark/>
-          </w:tcPr>
-          <w:p>
-            <w:pPr>
-              <w:spacing w:after="0" w:line="240" w:lineRule="auto"/>
-              <w:rPr>
-                <w:rFonts w:eastAsia="Times New Roman" w:cs="Noto Sans"/>
-                <w:kern w:val="0"/>
-                <w14:ligatures w14:val="none"/>
-              </w:rPr>
-            </w:pPr>
-            <w:r>
-              <w:rPr>
-                <w:rFonts w:eastAsia="Times New Roman" w:cs="Noto Sans"/>
-                <w:kern w:val="0"/>
-                <w14:ligatures w14:val="none"/>
-              </w:rPr>
               <w:t>P8</w:t>
             </w:r>
           </w:p>
@@ -6518,7 +6365,7 @@
                 <w:kern w:val="0"/>
                 <w14:ligatures w14:val="none"/>
               </w:rPr>
-              <w:t xml:space="preserve">3. </w:t>
+              <w:t>3. R</w:t>
             </w:r>
             <w:proofErr w:type="spellStart"/>
             <w:r>
@@ -6527,7 +6374,7 @@
                 <w:kern w:val="0"/>
                 <w14:ligatures w14:val="none"/>
               </w:rPr>
-              <w:t>Recolha</w:t>
+              <w:t>ecolha</w:t>
             </w:r>
             <w:proofErr w:type="spellEnd"/>
             <w:r>
@@ -6548,42 +6395,6 @@
               <w:t>deslocação</w:t>
             </w:r>
             <w:proofErr w:type="spellEnd"/>
-          </w:p>
-        </w:tc>
-        <w:tc>
-          <w:tcPr>
-            <w:tcW w:w="0" w:type="auto"/>
-            <w:tcBorders>
-              <w:top w:val="single" w:sz="6" w:space="0" w:color="auto"/>
-              <w:left w:val="single" w:sz="6" w:space="0" w:color="auto"/>
-              <w:bottom w:val="single" w:sz="6" w:space="0" w:color="auto"/>
-              <w:right w:val="single" w:sz="6" w:space="0" w:color="auto"/>
-            </w:tcBorders>
-            <w:tcMar>
-              <w:top w:w="60" w:type="dxa"/>
-              <w:left w:w="120" w:type="dxa"/>
-              <w:bottom w:w="60" w:type="dxa"/>
-              <w:right w:w="120" w:type="dxa"/>
-            </w:tcMar>
-            <w:hideMark/>
-          </w:tcPr>
-          <w:p>
-            <w:pPr>
-              <w:spacing w:after="0" w:line="240" w:lineRule="auto"/>
-              <w:rPr>
-                <w:rFonts w:eastAsia="Times New Roman" w:cs="Noto Sans"/>
-                <w:kern w:val="0"/>
-                <w14:ligatures w14:val="none"/>
-              </w:rPr>
-            </w:pPr>
-            <w:r>
-              <w:rPr>
-                <w:rFonts w:eastAsia="Times New Roman" w:cs="Noto Sans"/>
-                <w:kern w:val="0"/>
-                <w14:ligatures w14:val="none"/>
-              </w:rPr>
-              <w:t>OE4</w:t>
-            </w:r>
           </w:p>
         </w:tc>
         <w:tc>
@@ -6748,7 +6559,7 @@
                 <w:kern w:val="0"/>
                 <w14:ligatures w14:val="none"/>
               </w:rPr>
-              <w:t xml:space="preserve">4. </w:t>
+              <w:t>4. P</w:t>
             </w:r>
             <w:proofErr w:type="spellStart"/>
             <w:r>
@@ -6757,7 +6568,7 @@
                 <w:kern w:val="0"/>
                 <w14:ligatures w14:val="none"/>
               </w:rPr>
-              <w:t>Pagamento</w:t>
+              <w:t>agamento</w:t>
             </w:r>
             <w:proofErr w:type="spellEnd"/>
             <w:r>
@@ -6767,42 +6578,6 @@
                 <w14:ligatures w14:val="none"/>
               </w:rPr>
               <w:t xml:space="preserve"> e taxa</w:t>
-            </w:r>
-          </w:p>
-        </w:tc>
-        <w:tc>
-          <w:tcPr>
-            <w:tcW w:w="0" w:type="auto"/>
-            <w:tcBorders>
-              <w:top w:val="single" w:sz="6" w:space="0" w:color="auto"/>
-              <w:left w:val="single" w:sz="6" w:space="0" w:color="auto"/>
-              <w:bottom w:val="single" w:sz="6" w:space="0" w:color="auto"/>
-              <w:right w:val="single" w:sz="6" w:space="0" w:color="auto"/>
-            </w:tcBorders>
-            <w:tcMar>
-              <w:top w:w="60" w:type="dxa"/>
-              <w:left w:w="120" w:type="dxa"/>
-              <w:bottom w:w="60" w:type="dxa"/>
-              <w:right w:w="120" w:type="dxa"/>
-            </w:tcMar>
-            <w:hideMark/>
-          </w:tcPr>
-          <w:p>
-            <w:pPr>
-              <w:spacing w:after="0" w:line="240" w:lineRule="auto"/>
-              <w:rPr>
-                <w:rFonts w:eastAsia="Times New Roman" w:cs="Noto Sans"/>
-                <w:kern w:val="0"/>
-                <w14:ligatures w14:val="none"/>
-              </w:rPr>
-            </w:pPr>
-            <w:r>
-              <w:rPr>
-                <w:rFonts w:eastAsia="Times New Roman" w:cs="Noto Sans"/>
-                <w:kern w:val="0"/>
-                <w14:ligatures w14:val="none"/>
-              </w:rPr>
-              <w:t>OE6</w:t>
             </w:r>
           </w:p>
         </w:tc>
@@ -7014,42 +6789,6 @@
                 <w:kern w:val="0"/>
                 <w14:ligatures w14:val="none"/>
               </w:rPr>
-              <w:t>OE8</w:t>
-            </w:r>
-          </w:p>
-        </w:tc>
-        <w:tc>
-          <w:tcPr>
-            <w:tcW w:w="0" w:type="auto"/>
-            <w:tcBorders>
-              <w:top w:val="single" w:sz="6" w:space="0" w:color="auto"/>
-              <w:left w:val="single" w:sz="6" w:space="0" w:color="auto"/>
-              <w:bottom w:val="single" w:sz="6" w:space="0" w:color="auto"/>
-              <w:right w:val="single" w:sz="6" w:space="0" w:color="auto"/>
-            </w:tcBorders>
-            <w:tcMar>
-              <w:top w:w="60" w:type="dxa"/>
-              <w:left w:w="120" w:type="dxa"/>
-              <w:bottom w:w="60" w:type="dxa"/>
-              <w:right w:w="120" w:type="dxa"/>
-            </w:tcMar>
-            <w:hideMark/>
-          </w:tcPr>
-          <w:p>
-            <w:pPr>
-              <w:spacing w:after="0" w:line="240" w:lineRule="auto"/>
-              <w:rPr>
-                <w:rFonts w:eastAsia="Times New Roman" w:cs="Noto Sans"/>
-                <w:kern w:val="0"/>
-                <w14:ligatures w14:val="none"/>
-              </w:rPr>
-            </w:pPr>
-            <w:r>
-              <w:rPr>
-                <w:rFonts w:eastAsia="Times New Roman" w:cs="Noto Sans"/>
-                <w:kern w:val="0"/>
-                <w14:ligatures w14:val="none"/>
-              </w:rPr>
               <w:t>P17 a P18</w:t>
             </w:r>
           </w:p>
@@ -7188,7 +6927,6 @@
                 <w:kern w:val="0"/>
                 <w14:ligatures w14:val="none"/>
               </w:rPr>
-              <w:lastRenderedPageBreak/>
               <w:t xml:space="preserve">6. Interesse </w:t>
             </w:r>
             <w:proofErr w:type="spellStart"/>
@@ -7208,42 +6946,6 @@
                 <w14:ligatures w14:val="none"/>
               </w:rPr>
               <w:t xml:space="preserve"> app</w:t>
-            </w:r>
-          </w:p>
-        </w:tc>
-        <w:tc>
-          <w:tcPr>
-            <w:tcW w:w="0" w:type="auto"/>
-            <w:tcBorders>
-              <w:top w:val="single" w:sz="6" w:space="0" w:color="auto"/>
-              <w:left w:val="single" w:sz="6" w:space="0" w:color="auto"/>
-              <w:bottom w:val="single" w:sz="6" w:space="0" w:color="auto"/>
-              <w:right w:val="single" w:sz="6" w:space="0" w:color="auto"/>
-            </w:tcBorders>
-            <w:tcMar>
-              <w:top w:w="60" w:type="dxa"/>
-              <w:left w:w="120" w:type="dxa"/>
-              <w:bottom w:w="60" w:type="dxa"/>
-              <w:right w:w="120" w:type="dxa"/>
-            </w:tcMar>
-            <w:hideMark/>
-          </w:tcPr>
-          <w:p>
-            <w:pPr>
-              <w:spacing w:after="0" w:line="240" w:lineRule="auto"/>
-              <w:rPr>
-                <w:rFonts w:eastAsia="Times New Roman" w:cs="Noto Sans"/>
-                <w:kern w:val="0"/>
-                <w14:ligatures w14:val="none"/>
-              </w:rPr>
-            </w:pPr>
-            <w:r>
-              <w:rPr>
-                <w:rFonts w:eastAsia="Times New Roman" w:cs="Noto Sans"/>
-                <w:kern w:val="0"/>
-                <w14:ligatures w14:val="none"/>
-              </w:rPr>
-              <w:t>OE3</w:t>
             </w:r>
           </w:p>
         </w:tc>
@@ -7417,7 +7119,7 @@
                 <w:kern w:val="0"/>
                 <w14:ligatures w14:val="none"/>
               </w:rPr>
-              <w:t xml:space="preserve">7. </w:t>
+              <w:t>7. P</w:t>
             </w:r>
             <w:proofErr w:type="spellStart"/>
             <w:r>
@@ -7426,7 +7128,7 @@
                 <w:kern w:val="0"/>
                 <w14:ligatures w14:val="none"/>
               </w:rPr>
-              <w:t>Perfil</w:t>
+              <w:t>erfil</w:t>
             </w:r>
             <w:proofErr w:type="spellEnd"/>
           </w:p>
@@ -7463,42 +7165,6 @@
                 <w:kern w:val="0"/>
                 <w14:ligatures w14:val="none"/>
               </w:rPr>
-              <w:t>OE1</w:t>
-            </w:r>
-          </w:p>
-        </w:tc>
-        <w:tc>
-          <w:tcPr>
-            <w:tcW w:w="0" w:type="auto"/>
-            <w:tcBorders>
-              <w:top w:val="single" w:sz="6" w:space="0" w:color="auto"/>
-              <w:left w:val="single" w:sz="6" w:space="0" w:color="auto"/>
-              <w:bottom w:val="single" w:sz="6" w:space="0" w:color="auto"/>
-              <w:right w:val="single" w:sz="6" w:space="0" w:color="auto"/>
-            </w:tcBorders>
-            <w:tcMar>
-              <w:top w:w="60" w:type="dxa"/>
-              <w:left w:w="120" w:type="dxa"/>
-              <w:bottom w:w="60" w:type="dxa"/>
-              <w:right w:w="120" w:type="dxa"/>
-            </w:tcMar>
-            <w:hideMark/>
-          </w:tcPr>
-          <w:p>
-            <w:pPr>
-              <w:spacing w:after="0" w:line="240" w:lineRule="auto"/>
-              <w:rPr>
-                <w:rFonts w:eastAsia="Times New Roman" w:cs="Noto Sans"/>
-                <w:kern w:val="0"/>
-                <w14:ligatures w14:val="none"/>
-              </w:rPr>
-            </w:pPr>
-            <w:r>
-              <w:rPr>
-                <w:rFonts w:eastAsia="Times New Roman" w:cs="Noto Sans"/>
-                <w:kern w:val="0"/>
-                <w14:ligatures w14:val="none"/>
-              </w:rPr>
               <w:t>P23 a P29</w:t>
             </w:r>
           </w:p>
@@ -7591,197 +7257,6 @@
                 <w14:ligatures w14:val="none"/>
               </w:rPr>
               <w:t>única</w:t>
-            </w:r>
-            <w:proofErr w:type="spellEnd"/>
-          </w:p>
-        </w:tc>
-      </w:tr>
-      <w:tr>
-        <w:tc>
-          <w:tcPr>
-            <w:tcW w:w="0" w:type="auto"/>
-            <w:tcBorders>
-              <w:top w:val="single" w:sz="6" w:space="0" w:color="auto"/>
-              <w:left w:val="single" w:sz="6" w:space="0" w:color="auto"/>
-              <w:bottom w:val="single" w:sz="6" w:space="0" w:color="auto"/>
-              <w:right w:val="single" w:sz="6" w:space="0" w:color="auto"/>
-            </w:tcBorders>
-            <w:tcMar>
-              <w:top w:w="60" w:type="dxa"/>
-              <w:left w:w="120" w:type="dxa"/>
-              <w:bottom w:w="60" w:type="dxa"/>
-              <w:right w:w="120" w:type="dxa"/>
-            </w:tcMar>
-            <w:hideMark/>
-          </w:tcPr>
-          <w:p>
-            <w:pPr>
-              <w:spacing w:after="0" w:line="240" w:lineRule="auto"/>
-              <w:rPr>
-                <w:rFonts w:eastAsia="Times New Roman" w:cs="Noto Sans"/>
-                <w:kern w:val="0"/>
-                <w14:ligatures w14:val="none"/>
-              </w:rPr>
-            </w:pPr>
-            <w:r>
-              <w:rPr>
-                <w:rFonts w:eastAsia="Times New Roman" w:cs="Noto Sans"/>
-                <w:b/>
-                <w:bCs/>
-                <w:kern w:val="0"/>
-                <w:bdr w:val="none" w:sz="0" w:space="0" w:color="auto" w:frame="1"/>
-                <w14:ligatures w14:val="none"/>
-              </w:rPr>
-              <w:t>Total</w:t>
-            </w:r>
-          </w:p>
-        </w:tc>
-        <w:tc>
-          <w:tcPr>
-            <w:tcW w:w="0" w:type="auto"/>
-            <w:tcBorders>
-              <w:top w:val="single" w:sz="6" w:space="0" w:color="auto"/>
-              <w:left w:val="single" w:sz="6" w:space="0" w:color="auto"/>
-              <w:bottom w:val="single" w:sz="6" w:space="0" w:color="auto"/>
-              <w:right w:val="single" w:sz="6" w:space="0" w:color="auto"/>
-            </w:tcBorders>
-            <w:tcMar>
-              <w:top w:w="60" w:type="dxa"/>
-              <w:left w:w="120" w:type="dxa"/>
-              <w:bottom w:w="60" w:type="dxa"/>
-              <w:right w:w="120" w:type="dxa"/>
-            </w:tcMar>
-            <w:hideMark/>
-          </w:tcPr>
-          <w:p>
-            <w:pPr>
-              <w:spacing w:after="0" w:line="240" w:lineRule="auto"/>
-              <w:rPr>
-                <w:rFonts w:eastAsia="Times New Roman" w:cs="Noto Sans"/>
-                <w:kern w:val="0"/>
-                <w14:ligatures w14:val="none"/>
-              </w:rPr>
-            </w:pPr>
-          </w:p>
-        </w:tc>
-        <w:tc>
-          <w:tcPr>
-            <w:tcW w:w="0" w:type="auto"/>
-            <w:tcBorders>
-              <w:top w:val="single" w:sz="6" w:space="0" w:color="auto"/>
-              <w:left w:val="single" w:sz="6" w:space="0" w:color="auto"/>
-              <w:bottom w:val="single" w:sz="6" w:space="0" w:color="auto"/>
-              <w:right w:val="single" w:sz="6" w:space="0" w:color="auto"/>
-            </w:tcBorders>
-            <w:tcMar>
-              <w:top w:w="60" w:type="dxa"/>
-              <w:left w:w="120" w:type="dxa"/>
-              <w:bottom w:w="60" w:type="dxa"/>
-              <w:right w:w="120" w:type="dxa"/>
-            </w:tcMar>
-            <w:hideMark/>
-          </w:tcPr>
-          <w:p>
-            <w:pPr>
-              <w:spacing w:after="0" w:line="240" w:lineRule="auto"/>
-              <w:rPr>
-                <w:rFonts w:eastAsia="Times New Roman" w:cs="Times New Roman"/>
-                <w:kern w:val="0"/>
-                <w:sz w:val="20"/>
-                <w:szCs w:val="20"/>
-                <w14:ligatures w14:val="none"/>
-              </w:rPr>
-            </w:pPr>
-          </w:p>
-        </w:tc>
-        <w:tc>
-          <w:tcPr>
-            <w:tcW w:w="0" w:type="auto"/>
-            <w:tcBorders>
-              <w:top w:val="single" w:sz="6" w:space="0" w:color="auto"/>
-              <w:left w:val="single" w:sz="6" w:space="0" w:color="auto"/>
-              <w:bottom w:val="single" w:sz="6" w:space="0" w:color="auto"/>
-              <w:right w:val="single" w:sz="6" w:space="0" w:color="auto"/>
-            </w:tcBorders>
-            <w:tcMar>
-              <w:top w:w="60" w:type="dxa"/>
-              <w:left w:w="120" w:type="dxa"/>
-              <w:bottom w:w="60" w:type="dxa"/>
-              <w:right w:w="120" w:type="dxa"/>
-            </w:tcMar>
-            <w:hideMark/>
-          </w:tcPr>
-          <w:p>
-            <w:pPr>
-              <w:spacing w:after="0" w:line="240" w:lineRule="auto"/>
-              <w:rPr>
-                <w:rFonts w:eastAsia="Times New Roman" w:cs="Noto Sans"/>
-                <w:kern w:val="0"/>
-                <w14:ligatures w14:val="none"/>
-              </w:rPr>
-            </w:pPr>
-            <w:r>
-              <w:rPr>
-                <w:rFonts w:eastAsia="Times New Roman" w:cs="Noto Sans"/>
-                <w:kern w:val="0"/>
-                <w14:ligatures w14:val="none"/>
-              </w:rPr>
-              <w:t>29</w:t>
-            </w:r>
-          </w:p>
-        </w:tc>
-        <w:tc>
-          <w:tcPr>
-            <w:tcW w:w="0" w:type="auto"/>
-            <w:tcBorders>
-              <w:top w:val="single" w:sz="6" w:space="0" w:color="auto"/>
-              <w:left w:val="single" w:sz="6" w:space="0" w:color="auto"/>
-              <w:bottom w:val="single" w:sz="6" w:space="0" w:color="auto"/>
-              <w:right w:val="single" w:sz="6" w:space="0" w:color="auto"/>
-            </w:tcBorders>
-            <w:tcMar>
-              <w:top w:w="60" w:type="dxa"/>
-              <w:left w:w="120" w:type="dxa"/>
-              <w:bottom w:w="60" w:type="dxa"/>
-              <w:right w:w="120" w:type="dxa"/>
-            </w:tcMar>
-            <w:hideMark/>
-          </w:tcPr>
-          <w:p>
-            <w:pPr>
-              <w:spacing w:after="0" w:line="240" w:lineRule="auto"/>
-              <w:rPr>
-                <w:rFonts w:eastAsia="Times New Roman" w:cs="Noto Sans"/>
-                <w:kern w:val="0"/>
-                <w14:ligatures w14:val="none"/>
-              </w:rPr>
-            </w:pPr>
-            <w:proofErr w:type="spellStart"/>
-            <w:r>
-              <w:rPr>
-                <w:rFonts w:eastAsia="Times New Roman" w:cs="Noto Sans"/>
-                <w:kern w:val="0"/>
-                <w14:ligatures w14:val="none"/>
-              </w:rPr>
-              <w:t>Cerca</w:t>
-            </w:r>
-            <w:proofErr w:type="spellEnd"/>
-            <w:r>
-              <w:rPr>
-                <w:rFonts w:eastAsia="Times New Roman" w:cs="Noto Sans"/>
-                <w:kern w:val="0"/>
-                <w14:ligatures w14:val="none"/>
-              </w:rPr>
-              <w:t xml:space="preserve"> de 6 </w:t>
-            </w:r>
-            <w:proofErr w:type="spellStart"/>
-            <w:r>
-              <w:rPr>
-                <w:rFonts w:eastAsia="Times New Roman" w:cs="Noto Sans"/>
-                <w:kern w:val="0"/>
-                <w14:ligatures w14:val="none"/>
-              </w:rPr>
-              <w:t>minutos</w:t>
             </w:r>
             <w:proofErr w:type="spellEnd"/>
           </w:p>
@@ -7856,12 +7331,7 @@
         </w:rPr>
         <w:br w:type="page"/>
       </w:r>
-    </w:p>
-    <w:p>
-      <w:pPr>
-        <w:spacing w:before="240" w:after="120" w:line="330" w:lineRule="atLeast"/>
-        <w:textAlignment w:val="baseline"/>
-        <w:outlineLvl w:val="1"/>
+      <w:r>
         <w:rPr>
           <w:rFonts w:eastAsia="Times New Roman" w:cs="Noto Sans"/>
           <w:b/>
@@ -7872,18 +7342,6 @@
           <w:lang w:val="pt-PT"/>
           <w14:ligatures w14:val="none"/>
         </w:rPr>
-      </w:pPr>
-      <w:r>
-        <w:rPr>
-          <w:rFonts w:eastAsia="Times New Roman" w:cs="Noto Sans"/>
-          <w:b/>
-          <w:bCs/>
-          <w:kern w:val="0"/>
-          <w:sz w:val="36"/>
-          <w:szCs w:val="36"/>
-          <w:lang w:val="pt-PT"/>
-          <w14:ligatures w14:val="none"/>
-        </w:rPr>
         <w:lastRenderedPageBreak/>
         <w:t>3. Perguntas</w:t>
       </w:r>
@@ -7892,23 +7350,6 @@
       <w:pPr>
         <w:spacing w:before="240" w:after="120" w:line="330" w:lineRule="atLeast"/>
         <w:textAlignment w:val="baseline"/>
-        <w:outlineLvl w:val="1"/>
-        <w:rPr>
-          <w:rFonts w:eastAsia="Times New Roman" w:cs="Noto Sans"/>
-          <w:b/>
-          <w:bCs/>
-          <w:kern w:val="0"/>
-          <w:sz w:val="36"/>
-          <w:szCs w:val="36"/>
-          <w:lang w:val="pt-PT"/>
-          <w14:ligatures w14:val="none"/>
-        </w:rPr>
-      </w:pPr>
-    </w:p>
-    <w:p>
-      <w:pPr>
-        <w:spacing w:before="240" w:after="120" w:line="330" w:lineRule="atLeast"/>
-        <w:textAlignment w:val="baseline"/>
         <w:outlineLvl w:val="2"/>
         <w:rPr>
           <w:rFonts w:eastAsia="Times New Roman" w:cs="Noto Sans"/>
@@ -7955,42 +7396,6 @@
         </w:rPr>
         <w:t>Olá! Somos a GrowNear e queremos aproximar quem produz de quem compra. Para criarmos algo realmente útil, queremos conhecer os seus hábitos de compra de frutas, legumes e outros produtos locais. O questionário é anónimo e demora cerca de 6 minutos. As respostas são usadas apenas neste estudo de mercado. Não há respostas certas ou erradas: só queremos saber como compra hoje. Obrigado pela ajuda!</w:t>
       </w:r>
-    </w:p>
-    <w:p>
-      <w:pPr>
-        <w:spacing w:after="120" w:line="240" w:lineRule="auto"/>
-        <w:textAlignment w:val="baseline"/>
-        <w:rPr>
-          <w:rFonts w:eastAsia="Times New Roman" w:cs="Noto Sans"/>
-          <w:kern w:val="0"/>
-          <w:lang w:val="pt-PT"/>
-          <w14:ligatures w14:val="none"/>
-        </w:rPr>
-      </w:pPr>
-    </w:p>
-    <w:p>
-      <w:pPr>
-        <w:spacing w:after="120" w:line="240" w:lineRule="auto"/>
-        <w:textAlignment w:val="baseline"/>
-        <w:rPr>
-          <w:rFonts w:eastAsia="Times New Roman" w:cs="Noto Sans"/>
-          <w:kern w:val="0"/>
-          <w:lang w:val="pt-PT"/>
-          <w14:ligatures w14:val="none"/>
-        </w:rPr>
-      </w:pPr>
-    </w:p>
-    <w:p>
-      <w:pPr>
-        <w:spacing w:after="120" w:line="240" w:lineRule="auto"/>
-        <w:textAlignment w:val="baseline"/>
-        <w:rPr>
-          <w:rFonts w:eastAsia="Times New Roman" w:cs="Noto Sans"/>
-          <w:kern w:val="0"/>
-          <w:lang w:val="pt-PT"/>
-          <w14:ligatures w14:val="none"/>
-        </w:rPr>
-      </w:pPr>
     </w:p>
     <w:p>
       <w:pPr>
@@ -9186,130 +8591,139 @@
                 <w:kern w:val="0"/>
                 <w14:ligatures w14:val="none"/>
               </w:rPr>
+              <w:t>P6</w:t>
+            </w:r>
+          </w:p>
+        </w:tc>
+        <w:tc>
+          <w:tcPr>
+            <w:tcW w:w="0" w:type="auto"/>
+            <w:tcBorders>
+              <w:top w:val="single" w:sz="6" w:space="0" w:color="auto"/>
+              <w:left w:val="single" w:sz="6" w:space="0" w:color="auto"/>
+              <w:bottom w:val="single" w:sz="6" w:space="0" w:color="auto"/>
+              <w:right w:val="single" w:sz="6" w:space="0" w:color="auto"/>
+            </w:tcBorders>
+            <w:tcMar>
+              <w:top w:w="60" w:type="dxa"/>
+              <w:left w:w="120" w:type="dxa"/>
+              <w:bottom w:w="60" w:type="dxa"/>
+              <w:right w:w="120" w:type="dxa"/>
+            </w:tcMar>
+            <w:hideMark/>
+          </w:tcPr>
+          <w:p>
+            <w:pPr>
+              <w:spacing w:after="0" w:line="240" w:lineRule="auto"/>
+              <w:rPr>
+                <w:rFonts w:eastAsia="Times New Roman" w:cs="Noto Sans"/>
+                <w:kern w:val="0"/>
+                <w:lang w:val="pt-PT"/>
+                <w14:ligatures w14:val="none"/>
+              </w:rPr>
+            </w:pPr>
+            <w:r>
+              <w:rPr>
+                <w:rFonts w:eastAsia="Times New Roman" w:cs="Noto Sans"/>
+                <w:kern w:val="0"/>
+                <w:lang w:val="pt-PT"/>
+                <w14:ligatures w14:val="none"/>
+              </w:rPr>
+              <w:t>Nos últimos 12 meses, comprou frutas ou legumes através de cada um destes meios?</w:t>
+            </w:r>
+          </w:p>
+        </w:tc>
+        <w:tc>
+          <w:tcPr>
+            <w:tcW w:w="0" w:type="auto"/>
+            <w:tcBorders>
+              <w:top w:val="single" w:sz="6" w:space="0" w:color="auto"/>
+              <w:left w:val="single" w:sz="6" w:space="0" w:color="auto"/>
+              <w:bottom w:val="single" w:sz="6" w:space="0" w:color="auto"/>
+              <w:right w:val="single" w:sz="6" w:space="0" w:color="auto"/>
+            </w:tcBorders>
+            <w:tcMar>
+              <w:top w:w="60" w:type="dxa"/>
+              <w:left w:w="120" w:type="dxa"/>
+              <w:bottom w:w="60" w:type="dxa"/>
+              <w:right w:w="120" w:type="dxa"/>
+            </w:tcMar>
+            <w:hideMark/>
+          </w:tcPr>
+          <w:p>
+            <w:pPr>
+              <w:spacing w:after="0" w:line="240" w:lineRule="auto"/>
+              <w:rPr>
+                <w:rFonts w:eastAsia="Times New Roman" w:cs="Noto Sans"/>
+                <w:kern w:val="0"/>
+                <w14:ligatures w14:val="none"/>
+              </w:rPr>
+            </w:pPr>
+            <w:r>
+              <w:rPr>
+                <w:rFonts w:eastAsia="Times New Roman" w:cs="Noto Sans"/>
+                <w:kern w:val="0"/>
+                <w14:ligatures w14:val="none"/>
+              </w:rPr>
+              <w:t>Grelha Sim/</w:t>
+            </w:r>
+            <w:proofErr w:type="spellStart"/>
+            <w:r>
+              <w:rPr>
+                <w:rFonts w:eastAsia="Times New Roman" w:cs="Noto Sans"/>
+                <w:kern w:val="0"/>
+                <w14:ligatures w14:val="none"/>
+              </w:rPr>
+              <w:t>Não</w:t>
+            </w:r>
+            <w:proofErr w:type="spellEnd"/>
+          </w:p>
+        </w:tc>
+        <w:tc>
+          <w:tcPr>
+            <w:tcW w:w="0" w:type="auto"/>
+            <w:tcBorders>
+              <w:top w:val="single" w:sz="6" w:space="0" w:color="auto"/>
+              <w:left w:val="single" w:sz="6" w:space="0" w:color="auto"/>
+              <w:bottom w:val="single" w:sz="6" w:space="0" w:color="auto"/>
+              <w:right w:val="single" w:sz="6" w:space="0" w:color="auto"/>
+            </w:tcBorders>
+            <w:tcMar>
+              <w:top w:w="60" w:type="dxa"/>
+              <w:left w:w="120" w:type="dxa"/>
+              <w:bottom w:w="60" w:type="dxa"/>
+              <w:right w:w="120" w:type="dxa"/>
+            </w:tcMar>
+            <w:hideMark/>
+          </w:tcPr>
+          <w:p>
+            <w:pPr>
+              <w:spacing w:after="0" w:line="240" w:lineRule="auto"/>
+              <w:rPr>
+                <w:rFonts w:eastAsia="Times New Roman" w:cs="Noto Sans"/>
+                <w:kern w:val="0"/>
+                <w:lang w:val="pt-PT"/>
+                <w14:ligatures w14:val="none"/>
+              </w:rPr>
+            </w:pPr>
+            <w:r>
+              <w:rPr>
+                <w:rFonts w:eastAsia="Times New Roman" w:cs="Noto Sans"/>
+                <w:kern w:val="0"/>
+                <w:lang w:val="pt-PT"/>
+                <w14:ligatures w14:val="none"/>
+              </w:rPr>
+              <w:t xml:space="preserve">Linhas: Mercado municipal ou feira · Cabaz de produtores (subscrição ou encomenda) · Anúncios ou grupos online (OLX, Facebook, WhatsApp) · App contra o desperdício (ex.: Too </w:t>
+            </w:r>
+            <w:r>
+              <w:rPr>
+                <w:rFonts w:eastAsia="Times New Roman" w:cs="Noto Sans"/>
+                <w:kern w:val="0"/>
+                <w:lang w:val="pt-PT"/>
+                <w14:ligatures w14:val="none"/>
+              </w:rPr>
               <w:lastRenderedPageBreak/>
-              <w:t>P6</w:t>
-            </w:r>
-          </w:p>
-        </w:tc>
-        <w:tc>
-          <w:tcPr>
-            <w:tcW w:w="0" w:type="auto"/>
-            <w:tcBorders>
-              <w:top w:val="single" w:sz="6" w:space="0" w:color="auto"/>
-              <w:left w:val="single" w:sz="6" w:space="0" w:color="auto"/>
-              <w:bottom w:val="single" w:sz="6" w:space="0" w:color="auto"/>
-              <w:right w:val="single" w:sz="6" w:space="0" w:color="auto"/>
-            </w:tcBorders>
-            <w:tcMar>
-              <w:top w:w="60" w:type="dxa"/>
-              <w:left w:w="120" w:type="dxa"/>
-              <w:bottom w:w="60" w:type="dxa"/>
-              <w:right w:w="120" w:type="dxa"/>
-            </w:tcMar>
-            <w:hideMark/>
-          </w:tcPr>
-          <w:p>
-            <w:pPr>
-              <w:spacing w:after="0" w:line="240" w:lineRule="auto"/>
-              <w:rPr>
-                <w:rFonts w:eastAsia="Times New Roman" w:cs="Noto Sans"/>
-                <w:kern w:val="0"/>
-                <w:lang w:val="pt-PT"/>
-                <w14:ligatures w14:val="none"/>
-              </w:rPr>
-            </w:pPr>
-            <w:r>
-              <w:rPr>
-                <w:rFonts w:eastAsia="Times New Roman" w:cs="Noto Sans"/>
-                <w:kern w:val="0"/>
-                <w:lang w:val="pt-PT"/>
-                <w14:ligatures w14:val="none"/>
-              </w:rPr>
-              <w:t>Nos últimos 12 meses, comprou frutas ou legumes através de cada um destes meios?</w:t>
-            </w:r>
-          </w:p>
-        </w:tc>
-        <w:tc>
-          <w:tcPr>
-            <w:tcW w:w="0" w:type="auto"/>
-            <w:tcBorders>
-              <w:top w:val="single" w:sz="6" w:space="0" w:color="auto"/>
-              <w:left w:val="single" w:sz="6" w:space="0" w:color="auto"/>
-              <w:bottom w:val="single" w:sz="6" w:space="0" w:color="auto"/>
-              <w:right w:val="single" w:sz="6" w:space="0" w:color="auto"/>
-            </w:tcBorders>
-            <w:tcMar>
-              <w:top w:w="60" w:type="dxa"/>
-              <w:left w:w="120" w:type="dxa"/>
-              <w:bottom w:w="60" w:type="dxa"/>
-              <w:right w:w="120" w:type="dxa"/>
-            </w:tcMar>
-            <w:hideMark/>
-          </w:tcPr>
-          <w:p>
-            <w:pPr>
-              <w:spacing w:after="0" w:line="240" w:lineRule="auto"/>
-              <w:rPr>
-                <w:rFonts w:eastAsia="Times New Roman" w:cs="Noto Sans"/>
-                <w:kern w:val="0"/>
-                <w14:ligatures w14:val="none"/>
-              </w:rPr>
-            </w:pPr>
-            <w:r>
-              <w:rPr>
-                <w:rFonts w:eastAsia="Times New Roman" w:cs="Noto Sans"/>
-                <w:kern w:val="0"/>
-                <w14:ligatures w14:val="none"/>
-              </w:rPr>
-              <w:t>Grelha Sim/</w:t>
-            </w:r>
-            <w:proofErr w:type="spellStart"/>
-            <w:r>
-              <w:rPr>
-                <w:rFonts w:eastAsia="Times New Roman" w:cs="Noto Sans"/>
-                <w:kern w:val="0"/>
-                <w14:ligatures w14:val="none"/>
-              </w:rPr>
-              <w:t>Não</w:t>
-            </w:r>
-            <w:proofErr w:type="spellEnd"/>
-          </w:p>
-        </w:tc>
-        <w:tc>
-          <w:tcPr>
-            <w:tcW w:w="0" w:type="auto"/>
-            <w:tcBorders>
-              <w:top w:val="single" w:sz="6" w:space="0" w:color="auto"/>
-              <w:left w:val="single" w:sz="6" w:space="0" w:color="auto"/>
-              <w:bottom w:val="single" w:sz="6" w:space="0" w:color="auto"/>
-              <w:right w:val="single" w:sz="6" w:space="0" w:color="auto"/>
-            </w:tcBorders>
-            <w:tcMar>
-              <w:top w:w="60" w:type="dxa"/>
-              <w:left w:w="120" w:type="dxa"/>
-              <w:bottom w:w="60" w:type="dxa"/>
-              <w:right w:w="120" w:type="dxa"/>
-            </w:tcMar>
-            <w:hideMark/>
-          </w:tcPr>
-          <w:p>
-            <w:pPr>
-              <w:spacing w:after="0" w:line="240" w:lineRule="auto"/>
-              <w:rPr>
-                <w:rFonts w:eastAsia="Times New Roman" w:cs="Noto Sans"/>
-                <w:kern w:val="0"/>
-                <w:lang w:val="pt-PT"/>
-                <w14:ligatures w14:val="none"/>
-              </w:rPr>
-            </w:pPr>
-            <w:r>
-              <w:rPr>
-                <w:rFonts w:eastAsia="Times New Roman" w:cs="Noto Sans"/>
-                <w:kern w:val="0"/>
-                <w:lang w:val="pt-PT"/>
-                <w14:ligatures w14:val="none"/>
-              </w:rPr>
-              <w:t>Linhas: Mercado municipal ou feira · Cabaz de produtores (subscrição ou encomenda) · Anúncios ou grupos online (OLX, Facebook, WhatsApp) · App contra o desperdício (ex.: Too Good To Go) · Loja de produtos biológicos</w:t>
+              <w:t>Good To Go) · Loja de produtos biológicos</w:t>
             </w:r>
           </w:p>
         </w:tc>
@@ -9995,19 +9409,6 @@
         <w:outlineLvl w:val="2"/>
         <w:rPr>
           <w:rFonts w:eastAsia="Times New Roman" w:cs="Noto Sans"/>
-          <w:kern w:val="0"/>
-          <w:lang w:val="pt-PT"/>
-          <w14:ligatures w14:val="none"/>
-        </w:rPr>
-      </w:pPr>
-    </w:p>
-    <w:p>
-      <w:pPr>
-        <w:spacing w:before="240" w:after="120" w:line="330" w:lineRule="atLeast"/>
-        <w:textAlignment w:val="baseline"/>
-        <w:outlineLvl w:val="2"/>
-        <w:rPr>
-          <w:rFonts w:eastAsia="Times New Roman" w:cs="Noto Sans"/>
           <w:b/>
           <w:bCs/>
           <w:kern w:val="0"/>
@@ -10252,7 +9653,6 @@
                 <w:kern w:val="0"/>
                 <w14:ligatures w14:val="none"/>
               </w:rPr>
-              <w:lastRenderedPageBreak/>
               <w:t>N.º</w:t>
             </w:r>
             <w:proofErr w:type="gramEnd"/>
@@ -10742,7 +10142,17 @@
                 <w:lang w:val="pt-PT"/>
                 <w14:ligatures w14:val="none"/>
               </w:rPr>
-              <w:t>Em casa do produtor · Num ponto de recolha (café, mercearia) · É-me indiferente · Só compraria com entrega em casa</w:t>
+              <w:t xml:space="preserve">Em casa do produtor · Num ponto de recolha (café, mercearia) · É-me </w:t>
+            </w:r>
+            <w:r>
+              <w:rPr>
+                <w:rFonts w:eastAsia="Times New Roman" w:cs="Noto Sans"/>
+                <w:kern w:val="0"/>
+                <w:lang w:val="pt-PT"/>
+                <w14:ligatures w14:val="none"/>
+              </w:rPr>
+              <w:lastRenderedPageBreak/>
+              <w:t>indiferente · Só compraria com entrega em casa</w:t>
             </w:r>
           </w:p>
         </w:tc>
@@ -11986,7 +11396,6 @@
                 <w:kern w:val="0"/>
                 <w14:ligatures w14:val="none"/>
               </w:rPr>
-              <w:lastRenderedPageBreak/>
               <w:t>P16</w:t>
             </w:r>
           </w:p>
@@ -12158,7 +11567,12 @@
           <w14:ligatures w14:val="none"/>
         </w:rPr>
       </w:pPr>
-      <w:r>
+    </w:p>
+    <w:p>
+      <w:pPr>
+        <w:spacing w:before="240" w:after="120" w:line="330" w:lineRule="atLeast"/>
+        <w:textAlignment w:val="baseline"/>
+        <w:outlineLvl w:val="2"/>
         <w:rPr>
           <w:rFonts w:eastAsia="Times New Roman" w:cs="Noto Sans"/>
           <w:b/>
@@ -12169,6 +11583,19 @@
           <w:lang w:val="pt-PT"/>
           <w14:ligatures w14:val="none"/>
         </w:rPr>
+      </w:pPr>
+      <w:r>
+        <w:rPr>
+          <w:rFonts w:eastAsia="Times New Roman" w:cs="Noto Sans"/>
+          <w:b/>
+          <w:bCs/>
+          <w:kern w:val="0"/>
+          <w:sz w:val="27"/>
+          <w:szCs w:val="27"/>
+          <w:lang w:val="pt-PT"/>
+          <w14:ligatures w14:val="none"/>
+        </w:rPr>
+        <w:lastRenderedPageBreak/>
         <w:t>Secção 5 — Produtos da época (OE8)</w:t>
       </w:r>
     </w:p>
@@ -13525,7 +12952,6 @@
                 <w:kern w:val="0"/>
                 <w14:ligatures w14:val="none"/>
               </w:rPr>
-              <w:lastRenderedPageBreak/>
               <w:t>P21</w:t>
             </w:r>
           </w:p>
@@ -13849,7 +13275,17 @@
                 <w:lang w:val="pt-PT"/>
                 <w14:ligatures w14:val="none"/>
               </w:rPr>
-              <w:t>A deslocação para recolher · Falta de confiança em produtores que não conheço · Pouca variedade ou só produtos da época · O preço dos produtos · A taxa de serviço · Prefiro os locais onde já compro · Não quero instalar mais uma app · Não vejo nenhum obstáculo</w:t>
+              <w:t xml:space="preserve">A deslocação para recolher · Falta de confiança em produtores que não conheço · Pouca variedade ou só produtos da época · O preço dos </w:t>
+            </w:r>
+            <w:r>
+              <w:rPr>
+                <w:rFonts w:eastAsia="Times New Roman" w:cs="Noto Sans"/>
+                <w:kern w:val="0"/>
+                <w:lang w:val="pt-PT"/>
+                <w14:ligatures w14:val="none"/>
+              </w:rPr>
+              <w:lastRenderedPageBreak/>
+              <w:t>produtos · A taxa de serviço · Prefiro os locais onde já compro · Não quero instalar mais uma app · Não vejo nenhum obstáculo</w:t>
             </w:r>
           </w:p>
         </w:tc>
@@ -15329,17 +14765,7 @@
                 <w:lang w:val="pt-PT"/>
                 <w14:ligatures w14:val="none"/>
               </w:rPr>
-              <w:t xml:space="preserve">Qual o seu papel nas compras de </w:t>
-            </w:r>
-            <w:r>
-              <w:rPr>
-                <w:rFonts w:eastAsia="Times New Roman" w:cs="Noto Sans"/>
-                <w:kern w:val="0"/>
-                <w:lang w:val="pt-PT"/>
-                <w14:ligatures w14:val="none"/>
-              </w:rPr>
-              <w:lastRenderedPageBreak/>
-              <w:t>alimentos do agregado?</w:t>
+              <w:t>Qual o seu papel nas compras de alimentos do agregado?</w:t>
             </w:r>
           </w:p>
         </w:tc>
@@ -15376,7 +14802,6 @@
                 <w:kern w:val="0"/>
                 <w14:ligatures w14:val="none"/>
               </w:rPr>
-              <w:lastRenderedPageBreak/>
               <w:t>Escolha</w:t>
             </w:r>
             <w:proofErr w:type="spellEnd"/>

</xml_diff>